<commit_message>
docs: detalha fluxos de casos de uso com nome de botoes e de abas do menu. Close #26
</commit_message>
<xml_diff>
--- a/Requisitos/UC02-Manter Agendamento.docx
+++ b/Requisitos/UC02-Manter Agendamento.docx
@@ -6,11 +6,8 @@
       <w:pPr>
         <w:jc w:val="center"/>
         <w:rPr>
-          <w:b w:val="0"/>
-          <w:bCs w:val="0"/>
           <w:sz w:val="36"/>
           <w:szCs w:val="36"/>
-          <w:vertAlign w:val="baseline"/>
         </w:rPr>
       </w:pPr>
       <w:r>
@@ -20,7 +17,6 @@
           <w:color w:val="ff0000"/>
           <w:sz w:val="36"/>
           <w:szCs w:val="36"/>
-          <w:vertAlign w:val="baseline"/>
           <w:rtl w:val="0"/>
         </w:rPr>
         <w:t xml:space="preserve">UC02: </w:t>
@@ -46,7 +42,6 @@
         <w:rPr>
           <w:sz w:val="28"/>
           <w:szCs w:val="28"/>
-          <w:vertAlign w:val="baseline"/>
         </w:rPr>
       </w:pPr>
       <w:r>
@@ -58,15 +53,10 @@
     <w:p>
       <w:pPr>
         <w:pStyle w:val="Heading1"/>
-        <w:rPr>
-          <w:vertAlign w:val="baseline"/>
-        </w:rPr>
+        <w:rPr/>
       </w:pPr>
       <w:r>
         <w:rPr>
-          <w:b w:val="1"/>
-          <w:bCs w:val="1"/>
-          <w:vertAlign w:val="baseline"/>
           <w:rtl w:val="0"/>
         </w:rPr>
         <w:t xml:space="preserve">Seção: </w:t>
@@ -75,7 +65,6 @@
         <w:rPr>
           <w:b w:val="0"/>
           <w:bCs w:val="0"/>
-          <w:vertAlign w:val="baseline"/>
           <w:rtl w:val="0"/>
         </w:rPr>
         <w:t xml:space="preserve">Principal</w:t>
@@ -119,90 +108,54 @@
           <w:tblHeader w:val="0"/>
         </w:trPr>
         <w:tc>
-          <w:tcPr>
-            <w:vAlign w:val="top"/>
-          </w:tcPr>
-          <w:p>
-            <w:pPr>
+          <w:tcPr/>
+          <w:p>
+            <w:pPr>
+              <w:rPr>
+                <w:sz w:val="28"/>
+                <w:szCs w:val="28"/>
+              </w:rPr>
+            </w:pPr>
+            <w:r>
+              <w:rPr>
+                <w:b w:val="1"/>
+                <w:bCs w:val="1"/>
+                <w:sz w:val="28"/>
+                <w:szCs w:val="28"/>
+                <w:rtl w:val="0"/>
+              </w:rPr>
+              <w:t xml:space="preserve">Importância</w:t>
+            </w:r>
+            <w:r>
+              <w:rPr>
+                <w:rtl w:val="0"/>
+              </w:rPr>
+            </w:r>
+          </w:p>
+        </w:tc>
+        <w:tc>
+          <w:tcPr/>
+          <w:p>
+            <w:pPr>
+              <w:pStyle w:val="Heading1"/>
               <w:rPr>
                 <w:b w:val="0"/>
                 <w:bCs w:val="0"/>
-                <w:sz w:val="28"/>
-                <w:szCs w:val="28"/>
-                <w:vertAlign w:val="baseline"/>
-              </w:rPr>
-            </w:pPr>
-            <w:r>
-              <w:rPr>
-                <w:b w:val="1"/>
-                <w:bCs w:val="1"/>
-                <w:sz w:val="28"/>
-                <w:szCs w:val="28"/>
-                <w:vertAlign w:val="baseline"/>
-                <w:rtl w:val="0"/>
-              </w:rPr>
-              <w:t xml:space="preserve">Importância</w:t>
-            </w:r>
-            <w:r>
-              <w:rPr>
-                <w:rtl w:val="0"/>
-              </w:rPr>
-            </w:r>
-          </w:p>
-        </w:tc>
-        <w:tc>
-          <w:tcPr>
-            <w:vAlign w:val="top"/>
-          </w:tcPr>
-          <w:p>
-            <w:pPr>
-              <w:pStyle w:val="Heading1"/>
+              </w:rPr>
+            </w:pPr>
+            <w:r>
               <w:rPr>
                 <w:b w:val="0"/>
                 <w:bCs w:val="0"/>
-                <w:vertAlign w:val="baseline"/>
-              </w:rPr>
-            </w:pPr>
-            <w:r>
-              <w:rPr>
-                <w:b w:val="0"/>
-                <w:bCs w:val="0"/>
-                <w:rtl w:val="0"/>
-              </w:rPr>
-              <w:t xml:space="preserve">95</w:t>
-            </w:r>
-            <w:r>
-              <w:rPr>
-                <w:b w:val="0"/>
-                <w:bCs w:val="0"/>
-                <w:vertAlign w:val="baseline"/>
-                <w:rtl w:val="0"/>
-              </w:rPr>
-              <w:t xml:space="preserve"> (</w:t>
-            </w:r>
-            <w:r>
-              <w:rPr>
-                <w:b w:val="1"/>
-                <w:bCs w:val="1"/>
-                <w:vertAlign w:val="baseline"/>
-                <w:rtl w:val="0"/>
-              </w:rPr>
-              <w:t xml:space="preserve">Risco</w:t>
-            </w:r>
-            <w:r>
-              <w:rPr>
-                <w:rtl w:val="0"/>
-              </w:rPr>
-              <w:t xml:space="preserve"> Alto</w:t>
-            </w:r>
-            <w:r>
-              <w:rPr>
-                <w:b w:val="1"/>
-                <w:bCs w:val="1"/>
-                <w:vertAlign w:val="baseline"/>
-                <w:rtl w:val="0"/>
-              </w:rPr>
-              <w:t xml:space="preserve"> e Prioridade Alta)</w:t>
+                <w:rtl w:val="0"/>
+              </w:rPr>
+              <w:t xml:space="preserve">95 (</w:t>
+            </w:r>
+            <w:r>
+              <w:rPr>
+                <w:rtl w:val="0"/>
+              </w:rPr>
+              <w:t xml:space="preserve">Risco Alto e Prioridade Alta)</w:t>
             </w:r>
             <w:r>
               <w:rPr>
@@ -218,17 +171,12 @@
           <w:tblHeader w:val="0"/>
         </w:trPr>
         <w:tc>
-          <w:tcPr>
-            <w:vAlign w:val="top"/>
-          </w:tcPr>
-          <w:p>
-            <w:pPr>
-              <w:rPr>
-                <w:b w:val="0"/>
-                <w:bCs w:val="0"/>
-                <w:sz w:val="28"/>
-                <w:szCs w:val="28"/>
-                <w:vertAlign w:val="baseline"/>
+          <w:tcPr/>
+          <w:p>
+            <w:pPr>
+              <w:rPr>
+                <w:sz w:val="28"/>
+                <w:szCs w:val="28"/>
               </w:rPr>
             </w:pPr>
             <w:r>
@@ -237,7 +185,6 @@
                 <w:bCs w:val="1"/>
                 <w:sz w:val="28"/>
                 <w:szCs w:val="28"/>
-                <w:vertAlign w:val="baseline"/>
                 <w:rtl w:val="0"/>
               </w:rPr>
               <w:t xml:space="preserve">Sumário</w:t>
@@ -250,15 +197,12 @@
           </w:p>
         </w:tc>
         <w:tc>
-          <w:tcPr>
-            <w:vAlign w:val="top"/>
-          </w:tcPr>
-          <w:p>
-            <w:pPr>
-              <w:rPr>
-                <w:sz w:val="28"/>
-                <w:szCs w:val="28"/>
-                <w:vertAlign w:val="baseline"/>
+          <w:tcPr/>
+          <w:p>
+            <w:pPr>
+              <w:rPr>
+                <w:sz w:val="28"/>
+                <w:szCs w:val="28"/>
               </w:rPr>
             </w:pPr>
             <w:r>
@@ -268,11 +212,6 @@
                 <w:rtl w:val="0"/>
               </w:rPr>
               <w:t xml:space="preserve">Permite ao cliente criar, visualizar e cancelar os seus agendamentos nos estabelecimentos.</w:t>
-            </w:r>
-            <w:r>
-              <w:rPr>
-                <w:rtl w:val="0"/>
-              </w:rPr>
             </w:r>
           </w:p>
         </w:tc>
@@ -283,17 +222,12 @@
           <w:tblHeader w:val="0"/>
         </w:trPr>
         <w:tc>
-          <w:tcPr>
-            <w:vAlign w:val="top"/>
-          </w:tcPr>
-          <w:p>
-            <w:pPr>
-              <w:rPr>
-                <w:b w:val="0"/>
-                <w:bCs w:val="0"/>
-                <w:sz w:val="28"/>
-                <w:szCs w:val="28"/>
-                <w:vertAlign w:val="baseline"/>
+          <w:tcPr/>
+          <w:p>
+            <w:pPr>
+              <w:rPr>
+                <w:sz w:val="28"/>
+                <w:szCs w:val="28"/>
               </w:rPr>
             </w:pPr>
             <w:r>
@@ -302,7 +236,6 @@
                 <w:bCs w:val="1"/>
                 <w:sz w:val="28"/>
                 <w:szCs w:val="28"/>
-                <w:vertAlign w:val="baseline"/>
                 <w:rtl w:val="0"/>
               </w:rPr>
               <w:t xml:space="preserve">Ator Primário</w:t>
@@ -315,15 +248,12 @@
           </w:p>
         </w:tc>
         <w:tc>
-          <w:tcPr>
-            <w:vAlign w:val="top"/>
-          </w:tcPr>
-          <w:p>
-            <w:pPr>
-              <w:rPr>
-                <w:sz w:val="28"/>
-                <w:szCs w:val="28"/>
-                <w:vertAlign w:val="baseline"/>
+          <w:tcPr/>
+          <w:p>
+            <w:pPr>
+              <w:rPr>
+                <w:sz w:val="28"/>
+                <w:szCs w:val="28"/>
               </w:rPr>
             </w:pPr>
             <w:r>
@@ -333,11 +263,6 @@
                 <w:rtl w:val="0"/>
               </w:rPr>
               <w:t xml:space="preserve">Cliente</w:t>
-            </w:r>
-            <w:r>
-              <w:rPr>
-                <w:rtl w:val="0"/>
-              </w:rPr>
             </w:r>
           </w:p>
         </w:tc>
@@ -348,17 +273,12 @@
           <w:tblHeader w:val="0"/>
         </w:trPr>
         <w:tc>
-          <w:tcPr>
-            <w:vAlign w:val="top"/>
-          </w:tcPr>
-          <w:p>
-            <w:pPr>
-              <w:rPr>
-                <w:b w:val="0"/>
-                <w:bCs w:val="0"/>
-                <w:sz w:val="28"/>
-                <w:szCs w:val="28"/>
-                <w:vertAlign w:val="baseline"/>
+          <w:tcPr/>
+          <w:p>
+            <w:pPr>
+              <w:rPr>
+                <w:sz w:val="28"/>
+                <w:szCs w:val="28"/>
               </w:rPr>
             </w:pPr>
             <w:r>
@@ -367,7 +287,6 @@
                 <w:bCs w:val="1"/>
                 <w:sz w:val="28"/>
                 <w:szCs w:val="28"/>
-                <w:vertAlign w:val="baseline"/>
                 <w:rtl w:val="0"/>
               </w:rPr>
               <w:t xml:space="preserve">Ator Secundário</w:t>
@@ -380,22 +299,18 @@
           </w:p>
         </w:tc>
         <w:tc>
-          <w:tcPr>
-            <w:vAlign w:val="top"/>
-          </w:tcPr>
-          <w:p>
-            <w:pPr>
-              <w:rPr>
-                <w:sz w:val="28"/>
-                <w:szCs w:val="28"/>
-                <w:vertAlign w:val="baseline"/>
-              </w:rPr>
-            </w:pPr>
-            <w:r>
-              <w:rPr>
-                <w:sz w:val="28"/>
-                <w:szCs w:val="28"/>
-                <w:vertAlign w:val="baseline"/>
+          <w:tcPr/>
+          <w:p>
+            <w:pPr>
+              <w:rPr>
+                <w:sz w:val="28"/>
+                <w:szCs w:val="28"/>
+              </w:rPr>
+            </w:pPr>
+            <w:r>
+              <w:rPr>
+                <w:sz w:val="28"/>
+                <w:szCs w:val="28"/>
                 <w:rtl w:val="0"/>
               </w:rPr>
               <w:t xml:space="preserve">-</w:t>
@@ -409,17 +324,12 @@
           <w:tblHeader w:val="0"/>
         </w:trPr>
         <w:tc>
-          <w:tcPr>
-            <w:vAlign w:val="top"/>
-          </w:tcPr>
-          <w:p>
-            <w:pPr>
-              <w:rPr>
-                <w:b w:val="0"/>
-                <w:bCs w:val="0"/>
-                <w:sz w:val="28"/>
-                <w:szCs w:val="28"/>
-                <w:vertAlign w:val="baseline"/>
+          <w:tcPr/>
+          <w:p>
+            <w:pPr>
+              <w:rPr>
+                <w:sz w:val="28"/>
+                <w:szCs w:val="28"/>
               </w:rPr>
             </w:pPr>
             <w:r>
@@ -428,7 +338,6 @@
                 <w:bCs w:val="1"/>
                 <w:sz w:val="28"/>
                 <w:szCs w:val="28"/>
-                <w:vertAlign w:val="baseline"/>
                 <w:rtl w:val="0"/>
               </w:rPr>
               <w:t xml:space="preserve">Pré-Condição</w:t>
@@ -441,42 +350,21 @@
           </w:p>
         </w:tc>
         <w:tc>
-          <w:tcPr>
-            <w:vAlign w:val="top"/>
-          </w:tcPr>
-          <w:p>
-            <w:pPr>
-              <w:rPr>
-                <w:sz w:val="28"/>
-                <w:szCs w:val="28"/>
-                <w:vertAlign w:val="baseline"/>
-              </w:rPr>
-            </w:pPr>
-            <w:r>
-              <w:rPr>
-                <w:sz w:val="28"/>
-                <w:szCs w:val="28"/>
-                <w:vertAlign w:val="baseline"/>
-                <w:rtl w:val="0"/>
-              </w:rPr>
-              <w:t xml:space="preserve">O </w:t>
-            </w:r>
-            <w:r>
-              <w:rPr>
-                <w:sz w:val="28"/>
-                <w:szCs w:val="28"/>
-                <w:rtl w:val="0"/>
-              </w:rPr>
-              <w:t xml:space="preserve">cliente</w:t>
-            </w:r>
-            <w:r>
-              <w:rPr>
-                <w:sz w:val="28"/>
-                <w:szCs w:val="28"/>
-                <w:vertAlign w:val="baseline"/>
-                <w:rtl w:val="0"/>
-              </w:rPr>
-              <w:t xml:space="preserve"> fez a rotina de autenticação no sistema conforme </w:t>
+          <w:tcPr/>
+          <w:p>
+            <w:pPr>
+              <w:rPr>
+                <w:sz w:val="28"/>
+                <w:szCs w:val="28"/>
+              </w:rPr>
+            </w:pPr>
+            <w:r>
+              <w:rPr>
+                <w:sz w:val="28"/>
+                <w:szCs w:val="28"/>
+                <w:rtl w:val="0"/>
+              </w:rPr>
+              <w:t xml:space="preserve">O cliente fez a rotina de autenticação no sistema conforme </w:t>
             </w:r>
             <w:r>
               <w:rPr>
@@ -485,23 +373,12 @@
                 <w:szCs w:val="28"/>
                 <w:rtl w:val="0"/>
               </w:rPr>
-              <w:t xml:space="preserve">UC</w:t>
-            </w:r>
-            <w:r>
-              <w:rPr>
-                <w:color w:val="ff0000"/>
-                <w:sz w:val="28"/>
-                <w:szCs w:val="28"/>
-                <w:vertAlign w:val="baseline"/>
-                <w:rtl w:val="0"/>
-              </w:rPr>
-              <w:t xml:space="preserve">01-Autenticar Usuario</w:t>
-            </w:r>
-            <w:r>
-              <w:rPr>
-                <w:sz w:val="28"/>
-                <w:szCs w:val="28"/>
-                <w:vertAlign w:val="baseline"/>
+              <w:t xml:space="preserve">UC01-Autenticar Usuario</w:t>
+            </w:r>
+            <w:r>
+              <w:rPr>
+                <w:sz w:val="28"/>
+                <w:szCs w:val="28"/>
                 <w:rtl w:val="0"/>
               </w:rPr>
               <w:t xml:space="preserve">.</w:t>
@@ -515,17 +392,12 @@
           <w:tblHeader w:val="0"/>
         </w:trPr>
         <w:tc>
-          <w:tcPr>
-            <w:vAlign w:val="top"/>
-          </w:tcPr>
-          <w:p>
-            <w:pPr>
-              <w:rPr>
-                <w:b w:val="0"/>
-                <w:bCs w:val="0"/>
-                <w:sz w:val="28"/>
-                <w:szCs w:val="28"/>
-                <w:vertAlign w:val="baseline"/>
+          <w:tcPr/>
+          <w:p>
+            <w:pPr>
+              <w:rPr>
+                <w:sz w:val="28"/>
+                <w:szCs w:val="28"/>
               </w:rPr>
             </w:pPr>
             <w:r>
@@ -534,7 +406,6 @@
                 <w:bCs w:val="1"/>
                 <w:sz w:val="28"/>
                 <w:szCs w:val="28"/>
-                <w:vertAlign w:val="baseline"/>
                 <w:rtl w:val="0"/>
               </w:rPr>
               <w:t xml:space="preserve">Pós-Condição</w:t>
@@ -547,22 +418,18 @@
           </w:p>
         </w:tc>
         <w:tc>
-          <w:tcPr>
-            <w:vAlign w:val="top"/>
-          </w:tcPr>
-          <w:p>
-            <w:pPr>
-              <w:rPr>
-                <w:sz w:val="28"/>
-                <w:szCs w:val="28"/>
-                <w:vertAlign w:val="baseline"/>
-              </w:rPr>
-            </w:pPr>
-            <w:r>
-              <w:rPr>
-                <w:sz w:val="28"/>
-                <w:szCs w:val="28"/>
-                <w:vertAlign w:val="baseline"/>
+          <w:tcPr/>
+          <w:p>
+            <w:pPr>
+              <w:rPr>
+                <w:sz w:val="28"/>
+                <w:szCs w:val="28"/>
+              </w:rPr>
+            </w:pPr>
+            <w:r>
+              <w:rPr>
+                <w:sz w:val="28"/>
+                <w:szCs w:val="28"/>
                 <w:rtl w:val="0"/>
               </w:rPr>
               <w:t xml:space="preserve">-</w:t>
@@ -579,22 +446,16 @@
         <w:tc>
           <w:tcPr>
             <w:gridSpan w:val="2"/>
-            <w:vAlign w:val="top"/>
           </w:tcPr>
           <w:p>
             <w:pPr>
               <w:pStyle w:val="Heading2"/>
-              <w:rPr>
-                <w:b w:val="0"/>
-                <w:bCs w:val="0"/>
-                <w:vertAlign w:val="baseline"/>
-              </w:rPr>
+              <w:rPr/>
             </w:pPr>
             <w:r>
               <w:rPr>
                 <w:b w:val="1"/>
                 <w:bCs w:val="1"/>
-                <w:vertAlign w:val="baseline"/>
                 <w:rtl w:val="0"/>
               </w:rPr>
               <w:t xml:space="preserve">Fluxo Principal</w:t>
@@ -616,7 +477,6 @@
         <w:tc>
           <w:tcPr>
             <w:gridSpan w:val="2"/>
-            <w:vAlign w:val="top"/>
           </w:tcPr>
           <w:p>
             <w:pPr>
@@ -624,19 +484,19 @@
                 <w:ilvl w:val="0"/>
                 <w:numId w:val="2"/>
               </w:numPr>
-              <w:ind w:left="360"/>
-              <w:rPr>
-                <w:sz w:val="28"/>
-                <w:szCs w:val="28"/>
-              </w:rPr>
-            </w:pPr>
-            <w:r>
-              <w:rPr>
-                <w:sz w:val="28"/>
-                <w:szCs w:val="28"/>
-                <w:rtl w:val="0"/>
-              </w:rPr>
-              <w:t xml:space="preserve">Ator seleciona aba de Estabelecimento no menu do sistema. </w:t>
+              <w:ind w:left="360" w:hanging="360"/>
+              <w:rPr>
+                <w:sz w:val="28"/>
+                <w:szCs w:val="28"/>
+              </w:rPr>
+            </w:pPr>
+            <w:r>
+              <w:rPr>
+                <w:sz w:val="28"/>
+                <w:szCs w:val="28"/>
+                <w:rtl w:val="0"/>
+              </w:rPr>
+              <w:t xml:space="preserve">Ator seleciona aba “Estabelecimentos” no menu do sistema. </w:t>
             </w:r>
           </w:p>
           <w:p>
@@ -645,7 +505,7 @@
                 <w:ilvl w:val="0"/>
                 <w:numId w:val="2"/>
               </w:numPr>
-              <w:ind w:left="360"/>
+              <w:ind w:left="360" w:hanging="360"/>
               <w:rPr>
                 <w:sz w:val="28"/>
                 <w:szCs w:val="28"/>
@@ -683,11 +543,10 @@
                 <w:ilvl w:val="0"/>
                 <w:numId w:val="2"/>
               </w:numPr>
-              <w:ind w:left="360"/>
-              <w:rPr>
-                <w:sz w:val="28"/>
-                <w:szCs w:val="28"/>
-                <w:u w:val="none"/>
+              <w:ind w:left="360" w:hanging="360"/>
+              <w:rPr>
+                <w:sz w:val="28"/>
+                <w:szCs w:val="28"/>
               </w:rPr>
             </w:pPr>
             <w:r>
@@ -722,11 +581,10 @@
                 <w:ilvl w:val="0"/>
                 <w:numId w:val="2"/>
               </w:numPr>
-              <w:ind w:left="360"/>
-              <w:rPr>
-                <w:sz w:val="28"/>
-                <w:szCs w:val="28"/>
-                <w:u w:val="none"/>
+              <w:ind w:left="360" w:hanging="360"/>
+              <w:rPr>
+                <w:sz w:val="28"/>
+                <w:szCs w:val="28"/>
               </w:rPr>
             </w:pPr>
             <w:r>
@@ -753,7 +611,7 @@
                 <w:szCs w:val="28"/>
                 <w:rtl w:val="0"/>
               </w:rPr>
-              <w:t xml:space="preserve">a) Inserção: Ver </w:t>
+              <w:t xml:space="preserve">a) “Agendar”: Ver </w:t>
             </w:r>
             <w:r>
               <w:rPr>
@@ -779,7 +637,7 @@
                 <w:szCs w:val="28"/>
                 <w:rtl w:val="0"/>
               </w:rPr>
-              <w:t xml:space="preserve">b) Remoção: Ver </w:t>
+              <w:t xml:space="preserve">b) “Cancelar”: Ver </w:t>
             </w:r>
             <w:r>
               <w:rPr>
@@ -802,11 +660,10 @@
                 <w:ilvl w:val="0"/>
                 <w:numId w:val="2"/>
               </w:numPr>
-              <w:ind w:left="360"/>
-              <w:rPr>
-                <w:sz w:val="28"/>
-                <w:szCs w:val="28"/>
-                <w:u w:val="none"/>
+              <w:ind w:left="360" w:hanging="360"/>
+              <w:rPr>
+                <w:sz w:val="28"/>
+                <w:szCs w:val="28"/>
               </w:rPr>
             </w:pPr>
             <w:r>
@@ -816,11 +673,6 @@
                 <w:rtl w:val="0"/>
               </w:rPr>
               <w:t xml:space="preserve">Retorna ao passo 2</w:t>
-            </w:r>
-            <w:r>
-              <w:rPr>
-                <w:rtl w:val="0"/>
-              </w:rPr>
             </w:r>
           </w:p>
         </w:tc>
@@ -834,7 +686,6 @@
         <w:tc>
           <w:tcPr>
             <w:gridSpan w:val="2"/>
-            <w:vAlign w:val="top"/>
           </w:tcPr>
           <w:p>
             <w:pPr>
@@ -845,7 +696,6 @@
                 <w:bCs w:val="1"/>
                 <w:sz w:val="28"/>
                 <w:szCs w:val="28"/>
-                <w:vertAlign w:val="baseline"/>
               </w:rPr>
             </w:pPr>
             <w:r>
@@ -857,11 +707,6 @@
                 <w:rtl w:val="0"/>
               </w:rPr>
               <w:t xml:space="preserve">Fluxo Alternativo</w:t>
-            </w:r>
-            <w:r>
-              <w:rPr>
-                <w:rtl w:val="0"/>
-              </w:rPr>
             </w:r>
           </w:p>
         </w:tc>
@@ -875,7 +720,6 @@
         <w:tc>
           <w:tcPr>
             <w:gridSpan w:val="2"/>
-            <w:vAlign w:val="top"/>
           </w:tcPr>
           <w:p>
             <w:pPr>
@@ -918,7 +762,7 @@
                 <w:szCs w:val="28"/>
                 <w:rtl w:val="0"/>
               </w:rPr>
-              <w:t xml:space="preserve">1. Ator seleciona aba de Agendamentos no menu do sistema.</w:t>
+              <w:t xml:space="preserve">1. Ator seleciona aba “Agendamentos” no menu do sistema.</w:t>
             </w:r>
           </w:p>
           <w:p>
@@ -987,7 +831,7 @@
                 <w:szCs w:val="28"/>
                 <w:rtl w:val="0"/>
               </w:rPr>
-              <w:t xml:space="preserve">a) Remoção: Ver </w:t>
+              <w:t xml:space="preserve">a) “Cancelar”: Ver </w:t>
             </w:r>
             <w:r>
               <w:rPr>
@@ -1001,7 +845,6 @@
           </w:p>
           <w:p>
             <w:pPr>
-              <w:ind w:left="0" w:firstLine="0"/>
               <w:rPr>
                 <w:color w:val="ff0000"/>
                 <w:sz w:val="28"/>
@@ -1016,7 +859,6 @@
           </w:p>
           <w:p>
             <w:pPr>
-              <w:ind w:left="360"/>
               <w:rPr>
                 <w:sz w:val="28"/>
                 <w:szCs w:val="28"/>
@@ -1043,24 +885,22 @@
           </w:p>
           <w:p>
             <w:pPr>
-              <w:ind w:left="360"/>
-              <w:rPr>
-                <w:sz w:val="28"/>
-                <w:szCs w:val="28"/>
-              </w:rPr>
-            </w:pPr>
-            <w:r>
-              <w:rPr>
-                <w:sz w:val="28"/>
-                <w:szCs w:val="28"/>
-                <w:rtl w:val="0"/>
-              </w:rPr>
-              <w:t xml:space="preserve">1. Ator seleciona aba de Agendamentos no menu do sistema.</w:t>
-            </w:r>
-          </w:p>
-          <w:p>
-            <w:pPr>
-              <w:ind w:left="360"/>
+              <w:rPr>
+                <w:sz w:val="28"/>
+                <w:szCs w:val="28"/>
+              </w:rPr>
+            </w:pPr>
+            <w:r>
+              <w:rPr>
+                <w:sz w:val="28"/>
+                <w:szCs w:val="28"/>
+                <w:rtl w:val="0"/>
+              </w:rPr>
+              <w:t xml:space="preserve">1. Ator seleciona aba “Agendamentos” no menu do sistema.</w:t>
+            </w:r>
+          </w:p>
+          <w:p>
+            <w:pPr>
               <w:rPr>
                 <w:sz w:val="28"/>
                 <w:szCs w:val="28"/>
@@ -1094,7 +934,6 @@
           </w:p>
           <w:p>
             <w:pPr>
-              <w:ind w:left="360"/>
               <w:rPr>
                 <w:color w:val="ff0000"/>
                 <w:sz w:val="28"/>
@@ -1107,7 +946,7 @@
                 <w:szCs w:val="28"/>
                 <w:rtl w:val="0"/>
               </w:rPr>
-              <w:t xml:space="preserve">3. Ator seleciona aba finalizados.</w:t>
+              <w:t xml:space="preserve">3. Ator seleciona aba “Finalizados”.</w:t>
             </w:r>
             <w:r>
               <w:rPr>
@@ -1120,7 +959,6 @@
     </w:tbl>
     <w:p>
       <w:pPr>
-        <w:jc w:val="left"/>
         <w:rPr/>
       </w:pPr>
       <w:r>
@@ -1131,7 +969,6 @@
     </w:p>
     <w:p>
       <w:pPr>
-        <w:jc w:val="left"/>
         <w:rPr/>
       </w:pPr>
       <w:r>
@@ -1142,7 +979,6 @@
     </w:p>
     <w:p>
       <w:pPr>
-        <w:jc w:val="left"/>
         <w:rPr/>
       </w:pPr>
       <w:r>
@@ -1153,7 +989,6 @@
     </w:p>
     <w:p>
       <w:pPr>
-        <w:jc w:val="left"/>
         <w:rPr/>
       </w:pPr>
       <w:r>
@@ -1164,7 +999,6 @@
     </w:p>
     <w:p>
       <w:pPr>
-        <w:jc w:val="left"/>
         <w:rPr/>
       </w:pPr>
       <w:r>
@@ -1175,7 +1009,6 @@
     </w:p>
     <w:p>
       <w:pPr>
-        <w:jc w:val="left"/>
         <w:rPr/>
       </w:pPr>
       <w:r>
@@ -1186,7 +1019,6 @@
     </w:p>
     <w:p>
       <w:pPr>
-        <w:jc w:val="left"/>
         <w:rPr/>
       </w:pPr>
       <w:r>
@@ -1197,7 +1029,6 @@
     </w:p>
     <w:p>
       <w:pPr>
-        <w:jc w:val="left"/>
         <w:rPr/>
       </w:pPr>
       <w:r>
@@ -1208,7 +1039,6 @@
     </w:p>
     <w:p>
       <w:pPr>
-        <w:jc w:val="left"/>
         <w:rPr/>
       </w:pPr>
       <w:r>
@@ -1219,7 +1049,6 @@
     </w:p>
     <w:p>
       <w:pPr>
-        <w:jc w:val="left"/>
         <w:rPr/>
       </w:pPr>
       <w:r>
@@ -1286,9 +1115,7 @@
           <w:tblHeader w:val="0"/>
         </w:trPr>
         <w:tc>
-          <w:tcPr>
-            <w:vAlign w:val="top"/>
-          </w:tcPr>
+          <w:tcPr/>
           <w:p>
             <w:pPr>
               <w:rPr>
@@ -1314,9 +1141,7 @@
           </w:p>
         </w:tc>
         <w:tc>
-          <w:tcPr>
-            <w:vAlign w:val="top"/>
-          </w:tcPr>
+          <w:tcPr/>
           <w:p>
             <w:pPr>
               <w:rPr>
@@ -1343,14 +1168,13 @@
         <w:tc>
           <w:tcPr>
             <w:gridSpan w:val="2"/>
-            <w:vAlign w:val="top"/>
           </w:tcPr>
           <w:p>
             <w:pPr>
               <w:pStyle w:val="Heading2"/>
               <w:rPr/>
             </w:pPr>
-            <w:bookmarkStart w:colFirst="0" w:colLast="0" w:name="_heading=h.swe7j15bv88p" w:id="0"/>
+            <w:bookmarkStart w:colFirst="0" w:colLast="0" w:name="_rivth94mey7t" w:id="0"/>
             <w:bookmarkEnd w:id="0"/>
             <w:r>
               <w:rPr>
@@ -1377,7 +1201,6 @@
         <w:tc>
           <w:tcPr>
             <w:gridSpan w:val="2"/>
-            <w:vAlign w:val="top"/>
           </w:tcPr>
           <w:p>
             <w:pPr>
@@ -1385,19 +1208,19 @@
                 <w:ilvl w:val="0"/>
                 <w:numId w:val="3"/>
               </w:numPr>
-              <w:ind w:left="360"/>
-              <w:rPr>
-                <w:sz w:val="28"/>
-                <w:szCs w:val="28"/>
-              </w:rPr>
-            </w:pPr>
-            <w:r>
-              <w:rPr>
-                <w:sz w:val="28"/>
-                <w:szCs w:val="28"/>
-                <w:rtl w:val="0"/>
-              </w:rPr>
-              <w:t xml:space="preserve">Ator solicita fazer agendamento.</w:t>
+              <w:ind w:left="360" w:hanging="360"/>
+              <w:rPr>
+                <w:sz w:val="28"/>
+                <w:szCs w:val="28"/>
+              </w:rPr>
+            </w:pPr>
+            <w:r>
+              <w:rPr>
+                <w:sz w:val="28"/>
+                <w:szCs w:val="28"/>
+                <w:rtl w:val="0"/>
+              </w:rPr>
+              <w:t xml:space="preserve">Ator clica em “Agendar”.</w:t>
             </w:r>
           </w:p>
           <w:p>
@@ -1406,7 +1229,7 @@
                 <w:ilvl w:val="0"/>
                 <w:numId w:val="3"/>
               </w:numPr>
-              <w:ind w:left="360"/>
+              <w:ind w:left="360" w:hanging="360"/>
               <w:rPr>
                 <w:sz w:val="28"/>
                 <w:szCs w:val="28"/>
@@ -1444,19 +1267,19 @@
                 <w:ilvl w:val="0"/>
                 <w:numId w:val="3"/>
               </w:numPr>
-              <w:ind w:left="360"/>
-              <w:rPr>
-                <w:sz w:val="28"/>
-                <w:szCs w:val="28"/>
-              </w:rPr>
-            </w:pPr>
-            <w:r>
-              <w:rPr>
-                <w:sz w:val="28"/>
-                <w:szCs w:val="28"/>
-                <w:rtl w:val="0"/>
-              </w:rPr>
-              <w:t xml:space="preserve">Ator seleciona todos os serviços que gostaria no agendamento.</w:t>
+              <w:ind w:left="360" w:hanging="360"/>
+              <w:rPr>
+                <w:sz w:val="28"/>
+                <w:szCs w:val="28"/>
+              </w:rPr>
+            </w:pPr>
+            <w:r>
+              <w:rPr>
+                <w:sz w:val="28"/>
+                <w:szCs w:val="28"/>
+                <w:rtl w:val="0"/>
+              </w:rPr>
+              <w:t xml:space="preserve">Ator seleciona todos os serviços que gostaria no agendamento e clica em “Continuar”.</w:t>
             </w:r>
           </w:p>
           <w:p>
@@ -1465,7 +1288,7 @@
                 <w:ilvl w:val="0"/>
                 <w:numId w:val="3"/>
               </w:numPr>
-              <w:ind w:left="360"/>
+              <w:ind w:left="360" w:hanging="360"/>
               <w:rPr>
                 <w:sz w:val="28"/>
                 <w:szCs w:val="28"/>
@@ -1503,7 +1326,7 @@
                 <w:ilvl w:val="0"/>
                 <w:numId w:val="3"/>
               </w:numPr>
-              <w:ind w:left="360"/>
+              <w:ind w:left="360" w:hanging="360"/>
               <w:rPr>
                 <w:sz w:val="28"/>
                 <w:szCs w:val="28"/>
@@ -1524,7 +1347,7 @@
                 <w:ilvl w:val="0"/>
                 <w:numId w:val="3"/>
               </w:numPr>
-              <w:ind w:left="360"/>
+              <w:ind w:left="360" w:hanging="360"/>
               <w:rPr>
                 <w:sz w:val="28"/>
                 <w:szCs w:val="28"/>
@@ -1562,7 +1385,7 @@
                 <w:ilvl w:val="0"/>
                 <w:numId w:val="3"/>
               </w:numPr>
-              <w:ind w:left="360"/>
+              <w:ind w:left="360" w:hanging="360"/>
               <w:rPr>
                 <w:sz w:val="28"/>
                 <w:szCs w:val="28"/>
@@ -1583,7 +1406,7 @@
                 <w:ilvl w:val="0"/>
                 <w:numId w:val="3"/>
               </w:numPr>
-              <w:ind w:left="360"/>
+              <w:ind w:left="360" w:hanging="360"/>
               <w:rPr>
                 <w:sz w:val="28"/>
                 <w:szCs w:val="28"/>
@@ -1621,7 +1444,7 @@
                 <w:ilvl w:val="0"/>
                 <w:numId w:val="3"/>
               </w:numPr>
-              <w:ind w:left="360"/>
+              <w:ind w:left="360" w:hanging="360"/>
               <w:rPr>
                 <w:sz w:val="28"/>
                 <w:szCs w:val="28"/>
@@ -1642,7 +1465,7 @@
                 <w:ilvl w:val="0"/>
                 <w:numId w:val="3"/>
               </w:numPr>
-              <w:ind w:left="360"/>
+              <w:ind w:left="360" w:hanging="360"/>
               <w:rPr>
                 <w:sz w:val="28"/>
                 <w:szCs w:val="28"/>
@@ -1680,19 +1503,19 @@
                 <w:ilvl w:val="0"/>
                 <w:numId w:val="3"/>
               </w:numPr>
-              <w:ind w:left="360"/>
-              <w:rPr>
-                <w:sz w:val="28"/>
-                <w:szCs w:val="28"/>
-              </w:rPr>
-            </w:pPr>
-            <w:r>
-              <w:rPr>
-                <w:sz w:val="28"/>
-                <w:szCs w:val="28"/>
-                <w:rtl w:val="0"/>
-              </w:rPr>
-              <w:t xml:space="preserve">Ator confirma o agendamento.</w:t>
+              <w:ind w:left="360" w:hanging="360"/>
+              <w:rPr>
+                <w:sz w:val="28"/>
+                <w:szCs w:val="28"/>
+              </w:rPr>
+            </w:pPr>
+            <w:r>
+              <w:rPr>
+                <w:sz w:val="28"/>
+                <w:szCs w:val="28"/>
+                <w:rtl w:val="0"/>
+              </w:rPr>
+              <w:t xml:space="preserve">Ator clica em “Confirmar”.</w:t>
             </w:r>
           </w:p>
         </w:tc>
@@ -1706,11 +1529,10 @@
         <w:tc>
           <w:tcPr>
             <w:gridSpan w:val="2"/>
-            <w:vAlign w:val="top"/>
           </w:tcPr>
           <w:p>
             <w:pPr>
-              <w:ind w:left="360"/>
+              <w:ind w:left="360" w:firstLine="0"/>
               <w:jc w:val="center"/>
               <w:rPr>
                 <w:b w:val="1"/>
@@ -1741,11 +1563,9 @@
         <w:tc>
           <w:tcPr>
             <w:gridSpan w:val="2"/>
-            <w:vAlign w:val="top"/>
           </w:tcPr>
           <w:p>
             <w:pPr>
-              <w:ind w:left="0" w:firstLine="0"/>
               <w:rPr>
                 <w:sz w:val="28"/>
                 <w:szCs w:val="28"/>
@@ -1772,24 +1592,22 @@
           </w:p>
           <w:p>
             <w:pPr>
-              <w:ind w:left="0" w:firstLine="0"/>
-              <w:rPr>
-                <w:sz w:val="28"/>
-                <w:szCs w:val="28"/>
-              </w:rPr>
-            </w:pPr>
-            <w:r>
-              <w:rPr>
-                <w:sz w:val="28"/>
-                <w:szCs w:val="28"/>
-                <w:rtl w:val="0"/>
-              </w:rPr>
-              <w:t xml:space="preserve">1. Ator solicita voltar. </w:t>
-            </w:r>
-          </w:p>
-          <w:p>
-            <w:pPr>
-              <w:ind w:left="0" w:firstLine="0"/>
+              <w:rPr>
+                <w:sz w:val="28"/>
+                <w:szCs w:val="28"/>
+              </w:rPr>
+            </w:pPr>
+            <w:r>
+              <w:rPr>
+                <w:sz w:val="28"/>
+                <w:szCs w:val="28"/>
+                <w:rtl w:val="0"/>
+              </w:rPr>
+              <w:t xml:space="preserve">1. Ator clica em “Voltar”. </w:t>
+            </w:r>
+          </w:p>
+          <w:p>
+            <w:pPr>
               <w:rPr>
                 <w:sz w:val="28"/>
                 <w:szCs w:val="28"/>
@@ -1806,7 +1624,6 @@
           </w:p>
           <w:p>
             <w:pPr>
-              <w:ind w:left="0" w:firstLine="0"/>
               <w:rPr>
                 <w:sz w:val="28"/>
                 <w:szCs w:val="28"/>
@@ -1854,7 +1671,6 @@
           </w:p>
           <w:p>
             <w:pPr>
-              <w:ind w:left="0" w:firstLine="0"/>
               <w:rPr>
                 <w:sz w:val="28"/>
                 <w:szCs w:val="28"/>
@@ -1881,7 +1697,6 @@
           </w:p>
           <w:p>
             <w:pPr>
-              <w:ind w:left="0" w:firstLine="0"/>
               <w:rPr>
                 <w:sz w:val="28"/>
                 <w:szCs w:val="28"/>
@@ -1898,7 +1713,6 @@
           </w:p>
           <w:p>
             <w:pPr>
-              <w:ind w:left="0" w:firstLine="0"/>
               <w:rPr>
                 <w:sz w:val="28"/>
                 <w:szCs w:val="28"/>
@@ -1915,7 +1729,6 @@
           </w:p>
           <w:p>
             <w:pPr>
-              <w:ind w:left="0" w:firstLine="0"/>
               <w:rPr>
                 <w:sz w:val="28"/>
                 <w:szCs w:val="28"/>
@@ -1941,11 +1754,9 @@
         <w:tc>
           <w:tcPr>
             <w:gridSpan w:val="2"/>
-            <w:vAlign w:val="top"/>
           </w:tcPr>
           <w:p>
             <w:pPr>
-              <w:ind w:left="0" w:firstLine="0"/>
               <w:jc w:val="center"/>
               <w:rPr>
                 <w:b w:val="1"/>
@@ -1976,12 +1787,9 @@
         <w:tc>
           <w:tcPr>
             <w:gridSpan w:val="2"/>
-            <w:vAlign w:val="top"/>
           </w:tcPr>
           <w:p>
             <w:pPr>
-              <w:ind w:left="0" w:firstLine="0"/>
-              <w:jc w:val="left"/>
               <w:rPr>
                 <w:sz w:val="28"/>
                 <w:szCs w:val="28"/>
@@ -2003,7 +1811,7 @@
                 <w:szCs w:val="28"/>
                 <w:rtl w:val="0"/>
               </w:rPr>
-              <w:t xml:space="preserve">Agendamento não pode ser realizado. </w:t>
+              <w:t xml:space="preserve">Agendamento não pode ser realizado.  </w:t>
             </w:r>
           </w:p>
           <w:p>
@@ -2013,11 +1821,9 @@
                 <w:numId w:val="1"/>
               </w:numPr>
               <w:ind w:left="720" w:hanging="360"/>
-              <w:jc w:val="left"/>
-              <w:rPr>
-                <w:sz w:val="28"/>
-                <w:szCs w:val="28"/>
-                <w:u w:val="none"/>
+              <w:rPr>
+                <w:sz w:val="28"/>
+                <w:szCs w:val="28"/>
               </w:rPr>
             </w:pPr>
             <w:r>
@@ -2036,11 +1842,9 @@
                 <w:numId w:val="1"/>
               </w:numPr>
               <w:ind w:left="720" w:hanging="360"/>
-              <w:jc w:val="left"/>
-              <w:rPr>
-                <w:sz w:val="28"/>
-                <w:szCs w:val="28"/>
-                <w:u w:val="none"/>
+              <w:rPr>
+                <w:sz w:val="28"/>
+                <w:szCs w:val="28"/>
               </w:rPr>
             </w:pPr>
             <w:r>
@@ -2055,6 +1859,17 @@
         </w:tc>
       </w:tr>
     </w:tbl>
+    <w:p>
+      <w:pPr>
+        <w:jc w:val="center"/>
+        <w:rPr/>
+      </w:pPr>
+      <w:r>
+        <w:rPr>
+          <w:rtl w:val="0"/>
+        </w:rPr>
+      </w:r>
+    </w:p>
     <w:p>
       <w:pPr>
         <w:jc w:val="center"/>
@@ -2124,646 +1939,621 @@
         </w:rPr>
       </w:r>
     </w:p>
-    <w:sdt>
-      <w:sdtPr>
-        <w:lock w:val="contentLocked"/>
-        <w:id w:val="1572129464"/>
-        <w:tag w:val="goog_rdk_0"/>
-      </w:sdtPr>
-      <w:sdtContent>
-        <w:tbl>
-          <w:tblPr>
-            <w:tblStyle w:val="Table3"/>
-            <w:tblW w:w="10330.0" w:type="dxa"/>
-            <w:jc w:val="left"/>
-            <w:tblInd w:w="-70.0" w:type="dxa"/>
-            <w:tblBorders>
-              <w:top w:color="000000" w:space="0" w:sz="4" w:val="single"/>
-              <w:left w:color="000000" w:space="0" w:sz="4" w:val="single"/>
-              <w:bottom w:color="000000" w:space="0" w:sz="4" w:val="single"/>
-              <w:right w:color="000000" w:space="0" w:sz="4" w:val="single"/>
-              <w:insideH w:color="000000" w:space="0" w:sz="4" w:val="single"/>
-              <w:insideV w:color="000000" w:space="0" w:sz="4" w:val="single"/>
-            </w:tblBorders>
-            <w:tblLayout w:type="fixed"/>
-            <w:tblLook w:val="0000"/>
-          </w:tblPr>
+    <w:tbl>
+      <w:tblPr>
+        <w:tblStyle w:val="Table3"/>
+        <w:tblW w:w="10330.0" w:type="dxa"/>
+        <w:jc w:val="left"/>
+        <w:tblInd w:w="-70.0" w:type="dxa"/>
+        <w:tblBorders>
+          <w:top w:color="000000" w:space="0" w:sz="4" w:val="single"/>
+          <w:left w:color="000000" w:space="0" w:sz="4" w:val="single"/>
+          <w:bottom w:color="000000" w:space="0" w:sz="4" w:val="single"/>
+          <w:right w:color="000000" w:space="0" w:sz="4" w:val="single"/>
+          <w:insideH w:color="000000" w:space="0" w:sz="4" w:val="single"/>
+          <w:insideV w:color="000000" w:space="0" w:sz="4" w:val="single"/>
+        </w:tblBorders>
+        <w:tblLayout w:type="fixed"/>
+        <w:tblLook w:val="0000"/>
+      </w:tblPr>
+      <w:tblGrid>
+        <w:gridCol w:w="2905"/>
+        <w:gridCol w:w="7425"/>
+        <w:tblGridChange w:id="0">
           <w:tblGrid>
             <w:gridCol w:w="2905"/>
             <w:gridCol w:w="7425"/>
-            <w:tblGridChange w:id="0">
-              <w:tblGrid>
-                <w:gridCol w:w="2905"/>
-                <w:gridCol w:w="7425"/>
-              </w:tblGrid>
-            </w:tblGridChange>
           </w:tblGrid>
-          <w:tr>
-            <w:trPr>
-              <w:cantSplit w:val="0"/>
-              <w:tblHeader w:val="0"/>
-            </w:trPr>
-            <w:tc>
-              <w:tcPr>
-                <w:vAlign w:val="top"/>
-              </w:tcPr>
-              <w:p>
-                <w:pPr>
-                  <w:rPr>
-                    <w:sz w:val="28"/>
-                    <w:szCs w:val="28"/>
-                  </w:rPr>
-                </w:pPr>
-                <w:r>
-                  <w:rPr>
-                    <w:b w:val="1"/>
-                    <w:bCs w:val="1"/>
-                    <w:sz w:val="28"/>
-                    <w:szCs w:val="28"/>
-                    <w:rtl w:val="0"/>
-                  </w:rPr>
-                  <w:t xml:space="preserve">Sumário</w:t>
-                </w:r>
-                <w:r>
-                  <w:rPr>
-                    <w:rtl w:val="0"/>
-                  </w:rPr>
-                </w:r>
-              </w:p>
-            </w:tc>
-            <w:tc>
-              <w:tcPr>
-                <w:vAlign w:val="top"/>
-              </w:tcPr>
-              <w:p>
-                <w:pPr>
-                  <w:rPr>
-                    <w:sz w:val="28"/>
-                    <w:szCs w:val="28"/>
-                  </w:rPr>
-                </w:pPr>
-                <w:r>
-                  <w:rPr>
-                    <w:sz w:val="28"/>
-                    <w:szCs w:val="28"/>
-                    <w:rtl w:val="0"/>
-                  </w:rPr>
-                  <w:t xml:space="preserve">Remove agendamento do cliente do meio persistente.</w:t>
-                </w:r>
-              </w:p>
-            </w:tc>
-          </w:tr>
-          <w:tr>
-            <w:trPr>
-              <w:cantSplit w:val="1"/>
-              <w:tblHeader w:val="0"/>
-            </w:trPr>
-            <w:tc>
-              <w:tcPr>
-                <w:gridSpan w:val="2"/>
-                <w:vAlign w:val="top"/>
-              </w:tcPr>
-              <w:p>
-                <w:pPr>
-                  <w:pStyle w:val="Heading2"/>
-                  <w:rPr/>
-                </w:pPr>
-                <w:bookmarkStart w:colFirst="0" w:colLast="0" w:name="_heading=h.9yjlkz92gkoj" w:id="1"/>
-                <w:bookmarkEnd w:id="1"/>
-                <w:r>
-                  <w:rPr>
-                    <w:b w:val="1"/>
-                    <w:bCs w:val="1"/>
-                    <w:rtl w:val="0"/>
-                  </w:rPr>
-                  <w:t xml:space="preserve">Fluxo Principal</w:t>
-                </w:r>
-                <w:r>
-                  <w:rPr>
-                    <w:rtl w:val="0"/>
-                  </w:rPr>
-                </w:r>
-              </w:p>
-            </w:tc>
-          </w:tr>
-          <w:tr>
-            <w:trPr>
-              <w:cantSplit w:val="0"/>
-              <w:trHeight w:val="1615" w:hRule="atLeast"/>
-              <w:tblHeader w:val="0"/>
-            </w:trPr>
-            <w:tc>
-              <w:tcPr>
-                <w:gridSpan w:val="2"/>
-                <w:vAlign w:val="top"/>
-              </w:tcPr>
-              <w:p>
-                <w:pPr>
-                  <w:ind w:left="0" w:firstLine="0"/>
-                  <w:rPr>
-                    <w:sz w:val="28"/>
-                    <w:szCs w:val="28"/>
-                  </w:rPr>
-                </w:pPr>
-                <w:r>
-                  <w:rPr>
-                    <w:sz w:val="28"/>
-                    <w:szCs w:val="28"/>
-                    <w:rtl w:val="0"/>
-                  </w:rPr>
-                  <w:t xml:space="preserve">1. Ator solicita remover agendamento</w:t>
-                </w:r>
-              </w:p>
-              <w:p>
-                <w:pPr>
-                  <w:ind w:left="0" w:firstLine="0"/>
-                  <w:rPr>
-                    <w:sz w:val="28"/>
-                    <w:szCs w:val="28"/>
-                  </w:rPr>
-                </w:pPr>
-                <w:r>
-                  <w:rPr>
-                    <w:sz w:val="28"/>
-                    <w:szCs w:val="28"/>
-                    <w:rtl w:val="0"/>
-                  </w:rPr>
-                  <w:t xml:space="preserve">2. Sistema exibe a mensagem “Deseja realmente remover este agendamento?”</w:t>
-                </w:r>
-              </w:p>
-              <w:p>
-                <w:pPr>
-                  <w:ind w:left="0" w:firstLine="0"/>
-                  <w:rPr>
-                    <w:sz w:val="28"/>
-                    <w:szCs w:val="28"/>
-                  </w:rPr>
-                </w:pPr>
-                <w:r>
-                  <w:rPr>
-                    <w:sz w:val="28"/>
-                    <w:szCs w:val="28"/>
-                    <w:rtl w:val="0"/>
-                  </w:rPr>
-                  <w:t xml:space="preserve">3. Ator confirma a remoção</w:t>
-                </w:r>
-              </w:p>
-              <w:p>
-                <w:pPr>
-                  <w:ind w:left="0" w:firstLine="0"/>
-                  <w:rPr>
-                    <w:sz w:val="28"/>
-                    <w:szCs w:val="28"/>
-                  </w:rPr>
-                </w:pPr>
-                <w:r>
-                  <w:rPr>
-                    <w:sz w:val="28"/>
-                    <w:szCs w:val="28"/>
-                    <w:rtl w:val="0"/>
-                  </w:rPr>
-                  <w:t xml:space="preserve">4. Sistema exclui o agendamento do meio persistente.</w:t>
-                </w:r>
-              </w:p>
-            </w:tc>
-          </w:tr>
-          <w:tr>
-            <w:trPr>
-              <w:cantSplit w:val="0"/>
-              <w:trHeight w:val="303" w:hRule="atLeast"/>
-              <w:tblHeader w:val="0"/>
-            </w:trPr>
-            <w:tc>
-              <w:tcPr>
-                <w:gridSpan w:val="2"/>
-                <w:vAlign w:val="top"/>
-              </w:tcPr>
-              <w:p>
-                <w:pPr>
-                  <w:jc w:val="center"/>
-                  <w:rPr>
-                    <w:sz w:val="28"/>
-                    <w:szCs w:val="28"/>
-                  </w:rPr>
-                </w:pPr>
-                <w:r>
-                  <w:rPr>
-                    <w:b w:val="1"/>
-                    <w:bCs w:val="1"/>
-                    <w:sz w:val="28"/>
-                    <w:szCs w:val="28"/>
-                    <w:rtl w:val="0"/>
-                  </w:rPr>
-                  <w:t xml:space="preserve">Fluxo Alternativo</w:t>
-                </w:r>
-                <w:r>
-                  <w:rPr>
-                    <w:rtl w:val="0"/>
-                  </w:rPr>
-                </w:r>
-              </w:p>
-            </w:tc>
-          </w:tr>
-          <w:tr>
-            <w:trPr>
-              <w:cantSplit w:val="0"/>
-              <w:trHeight w:val="303" w:hRule="atLeast"/>
-              <w:tblHeader w:val="0"/>
-            </w:trPr>
-            <w:tc>
-              <w:tcPr>
-                <w:gridSpan w:val="2"/>
-                <w:vAlign w:val="top"/>
-              </w:tcPr>
-              <w:p>
-                <w:pPr>
-                  <w:jc w:val="both"/>
-                  <w:rPr>
-                    <w:sz w:val="28"/>
-                    <w:szCs w:val="28"/>
-                  </w:rPr>
-                </w:pPr>
-                <w:r>
-                  <w:rPr>
-                    <w:b w:val="1"/>
-                    <w:bCs w:val="1"/>
-                    <w:sz w:val="28"/>
-                    <w:szCs w:val="28"/>
-                    <w:rtl w:val="0"/>
-                  </w:rPr>
-                  <w:t xml:space="preserve">Linha 2: </w:t>
-                </w:r>
-                <w:r>
-                  <w:rPr>
-                    <w:sz w:val="28"/>
-                    <w:szCs w:val="28"/>
-                    <w:rtl w:val="0"/>
-                  </w:rPr>
-                  <w:t xml:space="preserve">Ator solicita cancelar. Retorna ao Passo 3 da </w:t>
-                </w:r>
-                <w:r>
-                  <w:rPr>
-                    <w:color w:val="ff0000"/>
-                    <w:sz w:val="28"/>
-                    <w:szCs w:val="28"/>
-                    <w:rtl w:val="0"/>
-                  </w:rPr>
-                  <w:t xml:space="preserve">Seção Principal</w:t>
-                </w:r>
-                <w:r>
-                  <w:rPr>
-                    <w:sz w:val="28"/>
-                    <w:szCs w:val="28"/>
-                    <w:rtl w:val="0"/>
-                  </w:rPr>
-                  <w:t xml:space="preserve">.</w:t>
-                </w:r>
-              </w:p>
-              <w:p>
-                <w:pPr>
-                  <w:jc w:val="both"/>
-                  <w:rPr>
-                    <w:sz w:val="28"/>
-                    <w:szCs w:val="28"/>
-                  </w:rPr>
-                </w:pPr>
-                <w:r>
-                  <w:rPr>
-                    <w:rtl w:val="0"/>
-                  </w:rPr>
-                </w:r>
-              </w:p>
-              <w:p>
-                <w:pPr>
-                  <w:jc w:val="both"/>
-                  <w:rPr>
-                    <w:sz w:val="28"/>
-                    <w:szCs w:val="28"/>
-                  </w:rPr>
-                </w:pPr>
-                <w:r>
-                  <w:rPr>
-                    <w:b w:val="1"/>
-                    <w:bCs w:val="1"/>
-                    <w:sz w:val="28"/>
-                    <w:szCs w:val="28"/>
-                    <w:rtl w:val="0"/>
-                  </w:rPr>
-                  <w:t xml:space="preserve">Linha 2:</w:t>
-                </w:r>
-                <w:r>
-                  <w:rPr>
-                    <w:sz w:val="28"/>
-                    <w:szCs w:val="28"/>
-                    <w:rtl w:val="0"/>
-                  </w:rPr>
-                  <w:t xml:space="preserve"> Remoção de agendamento sem devolução de sinal</w:t>
-                </w:r>
-              </w:p>
-              <w:p>
-                <w:pPr>
-                  <w:rPr>
-                    <w:sz w:val="28"/>
-                    <w:szCs w:val="28"/>
-                  </w:rPr>
-                </w:pPr>
-                <w:r>
-                  <w:rPr>
-                    <w:sz w:val="28"/>
-                    <w:szCs w:val="28"/>
-                    <w:rtl w:val="0"/>
-                  </w:rPr>
-                  <w:t xml:space="preserve">1. Sistema identifica que o serviço selecionado possuía pagamento de sinal. </w:t>
-                </w:r>
-              </w:p>
-              <w:p>
-                <w:pPr>
-                  <w:rPr>
-                    <w:sz w:val="28"/>
-                    <w:szCs w:val="28"/>
-                  </w:rPr>
-                </w:pPr>
-                <w:r>
-                  <w:rPr>
-                    <w:sz w:val="28"/>
-                    <w:szCs w:val="28"/>
-                    <w:rtl w:val="0"/>
-                  </w:rPr>
-                  <w:t xml:space="preserve">2. Sistema exibe a mensagem “O pagamento do sinal realizado não poderá ser devolvido. Deseja realmente remover este agendamento?”.</w:t>
-                </w:r>
-              </w:p>
-              <w:p>
-                <w:pPr>
-                  <w:rPr>
-                    <w:sz w:val="28"/>
-                    <w:szCs w:val="28"/>
-                  </w:rPr>
-                </w:pPr>
-                <w:r>
-                  <w:rPr>
-                    <w:sz w:val="28"/>
-                    <w:szCs w:val="28"/>
-                    <w:rtl w:val="0"/>
-                  </w:rPr>
-                  <w:t xml:space="preserve">3. Ator confirma a remoção.</w:t>
-                </w:r>
-              </w:p>
-              <w:p>
-                <w:pPr>
-                  <w:rPr>
-                    <w:sz w:val="28"/>
-                    <w:szCs w:val="28"/>
-                  </w:rPr>
-                </w:pPr>
-                <w:r>
-                  <w:rPr>
-                    <w:sz w:val="28"/>
-                    <w:szCs w:val="28"/>
-                    <w:rtl w:val="0"/>
-                  </w:rPr>
-                  <w:t xml:space="preserve">4. Sistema exclui o agendamento do meio persistente.</w:t>
-                </w:r>
-              </w:p>
-              <w:p>
-                <w:pPr>
-                  <w:rPr>
-                    <w:sz w:val="28"/>
-                    <w:szCs w:val="28"/>
-                  </w:rPr>
-                </w:pPr>
-                <w:r>
-                  <w:rPr>
-                    <w:rtl w:val="0"/>
-                  </w:rPr>
-                </w:r>
-              </w:p>
-              <w:p>
-                <w:pPr>
-                  <w:jc w:val="both"/>
-                  <w:rPr>
-                    <w:sz w:val="28"/>
-                    <w:szCs w:val="28"/>
-                  </w:rPr>
-                </w:pPr>
-                <w:r>
-                  <w:rPr>
-                    <w:b w:val="1"/>
-                    <w:bCs w:val="1"/>
-                    <w:sz w:val="28"/>
-                    <w:szCs w:val="28"/>
-                    <w:rtl w:val="0"/>
-                  </w:rPr>
-                  <w:t xml:space="preserve">Linha 2:</w:t>
-                </w:r>
-                <w:r>
-                  <w:rPr>
-                    <w:sz w:val="28"/>
-                    <w:szCs w:val="28"/>
-                    <w:rtl w:val="0"/>
-                  </w:rPr>
-                  <w:t xml:space="preserve"> Remoção de agendamento com devolução de sinal</w:t>
-                </w:r>
-              </w:p>
-              <w:p>
-                <w:pPr>
-                  <w:rPr>
-                    <w:sz w:val="28"/>
-                    <w:szCs w:val="28"/>
-                  </w:rPr>
-                </w:pPr>
-                <w:r>
-                  <w:rPr>
-                    <w:sz w:val="28"/>
-                    <w:szCs w:val="28"/>
-                    <w:rtl w:val="0"/>
-                  </w:rPr>
-                  <w:t xml:space="preserve">1. Sistema identifica que o serviço selecionado possuía pagamento de sinal. </w:t>
-                </w:r>
-              </w:p>
-              <w:p>
-                <w:pPr>
-                  <w:rPr>
-                    <w:sz w:val="28"/>
-                    <w:szCs w:val="28"/>
-                  </w:rPr>
-                </w:pPr>
-                <w:r>
-                  <w:rPr>
-                    <w:sz w:val="28"/>
-                    <w:szCs w:val="28"/>
-                    <w:rtl w:val="0"/>
-                  </w:rPr>
-                  <w:t xml:space="preserve">2. Sistema exibe mensagem “O estabelecimento será notificado e o sinal será devolvido em breve. Deseja realmente remover este agendamento?”</w:t>
-                </w:r>
-              </w:p>
-              <w:p>
-                <w:pPr>
-                  <w:rPr>
-                    <w:sz w:val="28"/>
-                    <w:szCs w:val="28"/>
-                  </w:rPr>
-                </w:pPr>
-                <w:r>
-                  <w:rPr>
-                    <w:sz w:val="28"/>
-                    <w:szCs w:val="28"/>
-                    <w:rtl w:val="0"/>
-                  </w:rPr>
-                  <w:t xml:space="preserve">3. Ator confirma a remoção.</w:t>
-                </w:r>
-              </w:p>
-              <w:p>
-                <w:pPr>
-                  <w:rPr>
-                    <w:sz w:val="28"/>
-                    <w:szCs w:val="28"/>
-                  </w:rPr>
-                </w:pPr>
-                <w:r>
-                  <w:rPr>
-                    <w:sz w:val="28"/>
-                    <w:szCs w:val="28"/>
-                    <w:rtl w:val="0"/>
-                  </w:rPr>
-                  <w:t xml:space="preserve">4. Sistema exclui o agendamento do meio persistente.</w:t>
-                </w:r>
-              </w:p>
-            </w:tc>
-          </w:tr>
-          <w:tr>
-            <w:trPr>
-              <w:cantSplit w:val="0"/>
-              <w:trHeight w:val="303" w:hRule="atLeast"/>
-              <w:tblHeader w:val="0"/>
-            </w:trPr>
-            <w:tc>
-              <w:tcPr>
-                <w:gridSpan w:val="2"/>
-                <w:vAlign w:val="top"/>
-              </w:tcPr>
-              <w:p>
-                <w:pPr>
-                  <w:jc w:val="center"/>
-                  <w:rPr>
-                    <w:b w:val="1"/>
-                    <w:bCs w:val="1"/>
-                    <w:sz w:val="28"/>
-                    <w:szCs w:val="28"/>
-                  </w:rPr>
-                </w:pPr>
-                <w:r>
-                  <w:rPr>
-                    <w:b w:val="1"/>
-                    <w:bCs w:val="1"/>
-                    <w:sz w:val="28"/>
-                    <w:szCs w:val="28"/>
-                    <w:rtl w:val="0"/>
-                  </w:rPr>
-                  <w:t xml:space="preserve">Fluxo Exceção</w:t>
-                </w:r>
-              </w:p>
-            </w:tc>
-          </w:tr>
-          <w:tr>
-            <w:trPr>
-              <w:cantSplit w:val="0"/>
-              <w:trHeight w:val="303" w:hRule="atLeast"/>
-              <w:tblHeader w:val="0"/>
-            </w:trPr>
-            <w:tc>
-              <w:tcPr>
-                <w:gridSpan w:val="2"/>
-                <w:vAlign w:val="top"/>
-              </w:tcPr>
-              <w:p>
-                <w:pPr>
-                  <w:jc w:val="left"/>
-                  <w:rPr>
-                    <w:sz w:val="28"/>
-                    <w:szCs w:val="28"/>
-                  </w:rPr>
-                </w:pPr>
-                <w:r>
-                  <w:rPr>
-                    <w:b w:val="1"/>
-                    <w:bCs w:val="1"/>
-                    <w:sz w:val="28"/>
-                    <w:szCs w:val="28"/>
-                    <w:rtl w:val="0"/>
-                  </w:rPr>
-                  <w:t xml:space="preserve">Linha 4: </w:t>
-                </w:r>
-                <w:r>
-                  <w:rPr>
-                    <w:sz w:val="28"/>
-                    <w:szCs w:val="28"/>
-                    <w:rtl w:val="0"/>
-                  </w:rPr>
-                  <w:t xml:space="preserve">Agendamento não pode ser removido. </w:t>
-                </w:r>
-              </w:p>
-              <w:p>
-                <w:pPr>
-                  <w:numPr>
-                    <w:ilvl w:val="0"/>
-                    <w:numId w:val="4"/>
-                  </w:numPr>
-                  <w:ind w:left="720" w:hanging="360"/>
-                  <w:rPr>
-                    <w:sz w:val="28"/>
-                    <w:szCs w:val="28"/>
-                  </w:rPr>
-                </w:pPr>
-                <w:r>
-                  <w:rPr>
-                    <w:sz w:val="28"/>
-                    <w:szCs w:val="28"/>
-                    <w:rtl w:val="0"/>
-                  </w:rPr>
-                  <w:t xml:space="preserve">Sistema exibe mensagem "O agendamento não pode ser removido."</w:t>
-                </w:r>
-              </w:p>
-              <w:p>
-                <w:pPr>
-                  <w:numPr>
-                    <w:ilvl w:val="0"/>
-                    <w:numId w:val="4"/>
-                  </w:numPr>
-                  <w:ind w:left="720" w:hanging="360"/>
-                  <w:rPr>
-                    <w:sz w:val="28"/>
-                    <w:szCs w:val="28"/>
-                  </w:rPr>
-                </w:pPr>
-                <w:r>
-                  <w:rPr>
-                    <w:sz w:val="28"/>
-                    <w:szCs w:val="28"/>
-                    <w:rtl w:val="0"/>
-                  </w:rPr>
-                  <w:t xml:space="preserve">Sistema retorna ao Passo 3 da Seção Principal.</w:t>
-                </w:r>
-              </w:p>
-              <w:p>
-                <w:pPr>
-                  <w:ind w:left="720" w:firstLine="0"/>
-                  <w:jc w:val="left"/>
-                  <w:rPr>
-                    <w:sz w:val="28"/>
-                    <w:szCs w:val="28"/>
-                  </w:rPr>
-                </w:pPr>
-                <w:r>
-                  <w:rPr>
-                    <w:rtl w:val="0"/>
-                  </w:rPr>
-                </w:r>
-              </w:p>
-            </w:tc>
-          </w:tr>
-        </w:tbl>
-      </w:sdtContent>
-    </w:sdt>
+        </w:tblGridChange>
+      </w:tblGrid>
+      <w:tr>
+        <w:trPr>
+          <w:cantSplit w:val="0"/>
+          <w:tblHeader w:val="0"/>
+        </w:trPr>
+        <w:tc>
+          <w:tcPr/>
+          <w:p>
+            <w:pPr>
+              <w:rPr>
+                <w:sz w:val="28"/>
+                <w:szCs w:val="28"/>
+              </w:rPr>
+            </w:pPr>
+            <w:r>
+              <w:rPr>
+                <w:b w:val="1"/>
+                <w:bCs w:val="1"/>
+                <w:sz w:val="28"/>
+                <w:szCs w:val="28"/>
+                <w:rtl w:val="0"/>
+              </w:rPr>
+              <w:t xml:space="preserve">Sumário</w:t>
+            </w:r>
+            <w:r>
+              <w:rPr>
+                <w:rtl w:val="0"/>
+              </w:rPr>
+            </w:r>
+          </w:p>
+        </w:tc>
+        <w:tc>
+          <w:tcPr/>
+          <w:p>
+            <w:pPr>
+              <w:rPr>
+                <w:sz w:val="28"/>
+                <w:szCs w:val="28"/>
+              </w:rPr>
+            </w:pPr>
+            <w:r>
+              <w:rPr>
+                <w:sz w:val="28"/>
+                <w:szCs w:val="28"/>
+                <w:rtl w:val="0"/>
+              </w:rPr>
+              <w:t xml:space="preserve">Remove agendamento do cliente do meio persistente.</w:t>
+            </w:r>
+          </w:p>
+        </w:tc>
+      </w:tr>
+      <w:tr>
+        <w:trPr>
+          <w:cantSplit w:val="1"/>
+          <w:tblHeader w:val="0"/>
+        </w:trPr>
+        <w:tc>
+          <w:tcPr>
+            <w:gridSpan w:val="2"/>
+          </w:tcPr>
+          <w:p>
+            <w:pPr>
+              <w:pStyle w:val="Heading2"/>
+              <w:rPr/>
+            </w:pPr>
+            <w:bookmarkStart w:colFirst="0" w:colLast="0" w:name="_7lwh86b1nxn" w:id="1"/>
+            <w:bookmarkEnd w:id="1"/>
+            <w:r>
+              <w:rPr>
+                <w:b w:val="1"/>
+                <w:bCs w:val="1"/>
+                <w:rtl w:val="0"/>
+              </w:rPr>
+              <w:t xml:space="preserve">Fluxo Principal</w:t>
+            </w:r>
+            <w:r>
+              <w:rPr>
+                <w:rtl w:val="0"/>
+              </w:rPr>
+            </w:r>
+          </w:p>
+        </w:tc>
+      </w:tr>
+      <w:tr>
+        <w:trPr>
+          <w:cantSplit w:val="0"/>
+          <w:trHeight w:val="1615" w:hRule="atLeast"/>
+          <w:tblHeader w:val="0"/>
+        </w:trPr>
+        <w:tc>
+          <w:tcPr>
+            <w:gridSpan w:val="2"/>
+          </w:tcPr>
+          <w:p>
+            <w:pPr>
+              <w:rPr>
+                <w:sz w:val="28"/>
+                <w:szCs w:val="28"/>
+              </w:rPr>
+            </w:pPr>
+            <w:r>
+              <w:rPr>
+                <w:sz w:val="28"/>
+                <w:szCs w:val="28"/>
+                <w:rtl w:val="0"/>
+              </w:rPr>
+              <w:t xml:space="preserve">1. Ator clica em “Cancelar”.</w:t>
+            </w:r>
+          </w:p>
+          <w:p>
+            <w:pPr>
+              <w:rPr>
+                <w:sz w:val="28"/>
+                <w:szCs w:val="28"/>
+              </w:rPr>
+            </w:pPr>
+            <w:r>
+              <w:rPr>
+                <w:sz w:val="28"/>
+                <w:szCs w:val="28"/>
+                <w:rtl w:val="0"/>
+              </w:rPr>
+              <w:t xml:space="preserve">2. Sistema exibe a mensagem “Deseja realmente remover este agendamento?”</w:t>
+            </w:r>
+          </w:p>
+          <w:p>
+            <w:pPr>
+              <w:rPr>
+                <w:sz w:val="28"/>
+                <w:szCs w:val="28"/>
+              </w:rPr>
+            </w:pPr>
+            <w:r>
+              <w:rPr>
+                <w:sz w:val="28"/>
+                <w:szCs w:val="28"/>
+                <w:rtl w:val="0"/>
+              </w:rPr>
+              <w:t xml:space="preserve">3. Ator clica em “Confirmar”</w:t>
+            </w:r>
+          </w:p>
+          <w:p>
+            <w:pPr>
+              <w:rPr>
+                <w:sz w:val="28"/>
+                <w:szCs w:val="28"/>
+              </w:rPr>
+            </w:pPr>
+            <w:r>
+              <w:rPr>
+                <w:sz w:val="28"/>
+                <w:szCs w:val="28"/>
+                <w:rtl w:val="0"/>
+              </w:rPr>
+              <w:t xml:space="preserve">4. Sistema exclui o agendamento do meio persistente.</w:t>
+            </w:r>
+          </w:p>
+        </w:tc>
+      </w:tr>
+      <w:tr>
+        <w:trPr>
+          <w:cantSplit w:val="0"/>
+          <w:trHeight w:val="303" w:hRule="atLeast"/>
+          <w:tblHeader w:val="0"/>
+        </w:trPr>
+        <w:tc>
+          <w:tcPr>
+            <w:gridSpan w:val="2"/>
+          </w:tcPr>
+          <w:p>
+            <w:pPr>
+              <w:jc w:val="center"/>
+              <w:rPr>
+                <w:sz w:val="28"/>
+                <w:szCs w:val="28"/>
+              </w:rPr>
+            </w:pPr>
+            <w:r>
+              <w:rPr>
+                <w:b w:val="1"/>
+                <w:bCs w:val="1"/>
+                <w:sz w:val="28"/>
+                <w:szCs w:val="28"/>
+                <w:rtl w:val="0"/>
+              </w:rPr>
+              <w:t xml:space="preserve">Fluxo Alternativo</w:t>
+            </w:r>
+            <w:r>
+              <w:rPr>
+                <w:rtl w:val="0"/>
+              </w:rPr>
+            </w:r>
+          </w:p>
+        </w:tc>
+      </w:tr>
+      <w:tr>
+        <w:trPr>
+          <w:cantSplit w:val="0"/>
+          <w:trHeight w:val="303" w:hRule="atLeast"/>
+          <w:tblHeader w:val="0"/>
+        </w:trPr>
+        <w:tc>
+          <w:tcPr>
+            <w:gridSpan w:val="2"/>
+          </w:tcPr>
+          <w:p>
+            <w:pPr>
+              <w:jc w:val="both"/>
+              <w:rPr>
+                <w:sz w:val="28"/>
+                <w:szCs w:val="28"/>
+              </w:rPr>
+            </w:pPr>
+            <w:r>
+              <w:rPr>
+                <w:b w:val="1"/>
+                <w:bCs w:val="1"/>
+                <w:sz w:val="28"/>
+                <w:szCs w:val="28"/>
+                <w:rtl w:val="0"/>
+              </w:rPr>
+              <w:t xml:space="preserve">Linha 2: </w:t>
+            </w:r>
+            <w:r>
+              <w:rPr>
+                <w:sz w:val="28"/>
+                <w:szCs w:val="28"/>
+                <w:rtl w:val="0"/>
+              </w:rPr>
+              <w:t xml:space="preserve">Ator solicita cancelar. Retorna ao Passo 3 da </w:t>
+            </w:r>
+            <w:r>
+              <w:rPr>
+                <w:color w:val="ff0000"/>
+                <w:sz w:val="28"/>
+                <w:szCs w:val="28"/>
+                <w:rtl w:val="0"/>
+              </w:rPr>
+              <w:t xml:space="preserve">Seção Principal</w:t>
+            </w:r>
+            <w:r>
+              <w:rPr>
+                <w:sz w:val="28"/>
+                <w:szCs w:val="28"/>
+                <w:rtl w:val="0"/>
+              </w:rPr>
+              <w:t xml:space="preserve">.</w:t>
+            </w:r>
+          </w:p>
+          <w:p>
+            <w:pPr>
+              <w:jc w:val="both"/>
+              <w:rPr>
+                <w:sz w:val="28"/>
+                <w:szCs w:val="28"/>
+              </w:rPr>
+            </w:pPr>
+            <w:r>
+              <w:rPr>
+                <w:rtl w:val="0"/>
+              </w:rPr>
+            </w:r>
+          </w:p>
+          <w:p>
+            <w:pPr>
+              <w:jc w:val="both"/>
+              <w:rPr>
+                <w:sz w:val="28"/>
+                <w:szCs w:val="28"/>
+              </w:rPr>
+            </w:pPr>
+            <w:r>
+              <w:rPr>
+                <w:b w:val="1"/>
+                <w:bCs w:val="1"/>
+                <w:sz w:val="28"/>
+                <w:szCs w:val="28"/>
+                <w:rtl w:val="0"/>
+              </w:rPr>
+              <w:t xml:space="preserve">Linha 2:</w:t>
+            </w:r>
+            <w:r>
+              <w:rPr>
+                <w:sz w:val="28"/>
+                <w:szCs w:val="28"/>
+                <w:rtl w:val="0"/>
+              </w:rPr>
+              <w:t xml:space="preserve"> Remoção de agendamento sem devolução de sinal</w:t>
+            </w:r>
+          </w:p>
+          <w:p>
+            <w:pPr>
+              <w:rPr>
+                <w:sz w:val="28"/>
+                <w:szCs w:val="28"/>
+              </w:rPr>
+            </w:pPr>
+            <w:r>
+              <w:rPr>
+                <w:sz w:val="28"/>
+                <w:szCs w:val="28"/>
+                <w:rtl w:val="0"/>
+              </w:rPr>
+              <w:t xml:space="preserve">1. Sistema identifica que o serviço selecionado possuía pagamento de sinal. </w:t>
+            </w:r>
+          </w:p>
+          <w:p>
+            <w:pPr>
+              <w:rPr>
+                <w:sz w:val="28"/>
+                <w:szCs w:val="28"/>
+              </w:rPr>
+            </w:pPr>
+            <w:r>
+              <w:rPr>
+                <w:sz w:val="28"/>
+                <w:szCs w:val="28"/>
+                <w:rtl w:val="0"/>
+              </w:rPr>
+              <w:t xml:space="preserve">2. Sistema exibe a mensagem “O pagamento do sinal realizado não poderá ser devolvido. Deseja realmente remover este agendamento?”.</w:t>
+            </w:r>
+          </w:p>
+          <w:p>
+            <w:pPr>
+              <w:rPr>
+                <w:sz w:val="28"/>
+                <w:szCs w:val="28"/>
+              </w:rPr>
+            </w:pPr>
+            <w:r>
+              <w:rPr>
+                <w:sz w:val="28"/>
+                <w:szCs w:val="28"/>
+                <w:rtl w:val="0"/>
+              </w:rPr>
+              <w:t xml:space="preserve">3. Ator clica em “Confirmar”.</w:t>
+            </w:r>
+          </w:p>
+          <w:p>
+            <w:pPr>
+              <w:rPr>
+                <w:sz w:val="28"/>
+                <w:szCs w:val="28"/>
+              </w:rPr>
+            </w:pPr>
+            <w:r>
+              <w:rPr>
+                <w:sz w:val="28"/>
+                <w:szCs w:val="28"/>
+                <w:rtl w:val="0"/>
+              </w:rPr>
+              <w:t xml:space="preserve">4. Sistema exclui o agendamento do meio persistente.</w:t>
+            </w:r>
+          </w:p>
+          <w:p>
+            <w:pPr>
+              <w:rPr>
+                <w:sz w:val="28"/>
+                <w:szCs w:val="28"/>
+              </w:rPr>
+            </w:pPr>
+            <w:r>
+              <w:rPr>
+                <w:rtl w:val="0"/>
+              </w:rPr>
+            </w:r>
+          </w:p>
+          <w:p>
+            <w:pPr>
+              <w:jc w:val="both"/>
+              <w:rPr>
+                <w:sz w:val="28"/>
+                <w:szCs w:val="28"/>
+              </w:rPr>
+            </w:pPr>
+            <w:r>
+              <w:rPr>
+                <w:b w:val="1"/>
+                <w:bCs w:val="1"/>
+                <w:sz w:val="28"/>
+                <w:szCs w:val="28"/>
+                <w:rtl w:val="0"/>
+              </w:rPr>
+              <w:t xml:space="preserve">Linha 2:</w:t>
+            </w:r>
+            <w:r>
+              <w:rPr>
+                <w:sz w:val="28"/>
+                <w:szCs w:val="28"/>
+                <w:rtl w:val="0"/>
+              </w:rPr>
+              <w:t xml:space="preserve"> Remoção de agendamento com devolução de sinal</w:t>
+            </w:r>
+          </w:p>
+          <w:p>
+            <w:pPr>
+              <w:rPr>
+                <w:sz w:val="28"/>
+                <w:szCs w:val="28"/>
+              </w:rPr>
+            </w:pPr>
+            <w:r>
+              <w:rPr>
+                <w:sz w:val="28"/>
+                <w:szCs w:val="28"/>
+                <w:rtl w:val="0"/>
+              </w:rPr>
+              <w:t xml:space="preserve">1. Sistema identifica que o serviço selecionado possuía pagamento de sinal. </w:t>
+            </w:r>
+          </w:p>
+          <w:p>
+            <w:pPr>
+              <w:rPr>
+                <w:sz w:val="28"/>
+                <w:szCs w:val="28"/>
+              </w:rPr>
+            </w:pPr>
+            <w:r>
+              <w:rPr>
+                <w:sz w:val="28"/>
+                <w:szCs w:val="28"/>
+                <w:rtl w:val="0"/>
+              </w:rPr>
+              <w:t xml:space="preserve">2. Sistema exibe mensagem “O estabelecimento será notificado e o sinal será devolvido em breve. Deseja realmente remover este agendamento?”</w:t>
+            </w:r>
+          </w:p>
+          <w:p>
+            <w:pPr>
+              <w:rPr>
+                <w:sz w:val="28"/>
+                <w:szCs w:val="28"/>
+              </w:rPr>
+            </w:pPr>
+            <w:r>
+              <w:rPr>
+                <w:sz w:val="28"/>
+                <w:szCs w:val="28"/>
+                <w:rtl w:val="0"/>
+              </w:rPr>
+              <w:t xml:space="preserve">3. Ator clica em “Confirmar”.</w:t>
+            </w:r>
+          </w:p>
+          <w:p>
+            <w:pPr>
+              <w:rPr>
+                <w:sz w:val="28"/>
+                <w:szCs w:val="28"/>
+              </w:rPr>
+            </w:pPr>
+            <w:r>
+              <w:rPr>
+                <w:sz w:val="28"/>
+                <w:szCs w:val="28"/>
+                <w:rtl w:val="0"/>
+              </w:rPr>
+              <w:t xml:space="preserve">4. Sistema exclui o agendamento do meio persistente.</w:t>
+            </w:r>
+          </w:p>
+        </w:tc>
+      </w:tr>
+      <w:tr>
+        <w:trPr>
+          <w:cantSplit w:val="0"/>
+          <w:trHeight w:val="303" w:hRule="atLeast"/>
+          <w:tblHeader w:val="0"/>
+        </w:trPr>
+        <w:tc>
+          <w:tcPr>
+            <w:gridSpan w:val="2"/>
+          </w:tcPr>
+          <w:p>
+            <w:pPr>
+              <w:jc w:val="center"/>
+              <w:rPr>
+                <w:b w:val="1"/>
+                <w:bCs w:val="1"/>
+                <w:sz w:val="28"/>
+                <w:szCs w:val="28"/>
+              </w:rPr>
+            </w:pPr>
+            <w:r>
+              <w:rPr>
+                <w:b w:val="1"/>
+                <w:bCs w:val="1"/>
+                <w:sz w:val="28"/>
+                <w:szCs w:val="28"/>
+                <w:rtl w:val="0"/>
+              </w:rPr>
+              <w:t xml:space="preserve">Fluxo Exceção</w:t>
+            </w:r>
+          </w:p>
+        </w:tc>
+      </w:tr>
+      <w:tr>
+        <w:trPr>
+          <w:cantSplit w:val="0"/>
+          <w:trHeight w:val="303" w:hRule="atLeast"/>
+          <w:tblHeader w:val="0"/>
+        </w:trPr>
+        <w:tc>
+          <w:tcPr>
+            <w:gridSpan w:val="2"/>
+          </w:tcPr>
+          <w:p>
+            <w:pPr>
+              <w:rPr>
+                <w:sz w:val="28"/>
+                <w:szCs w:val="28"/>
+              </w:rPr>
+            </w:pPr>
+            <w:r>
+              <w:rPr>
+                <w:b w:val="1"/>
+                <w:bCs w:val="1"/>
+                <w:sz w:val="28"/>
+                <w:szCs w:val="28"/>
+                <w:rtl w:val="0"/>
+              </w:rPr>
+              <w:t xml:space="preserve">Linha 4: </w:t>
+            </w:r>
+            <w:r>
+              <w:rPr>
+                <w:sz w:val="28"/>
+                <w:szCs w:val="28"/>
+                <w:rtl w:val="0"/>
+              </w:rPr>
+              <w:t xml:space="preserve">Agendamento não pode ser removido. </w:t>
+            </w:r>
+          </w:p>
+          <w:p>
+            <w:pPr>
+              <w:numPr>
+                <w:ilvl w:val="0"/>
+                <w:numId w:val="4"/>
+              </w:numPr>
+              <w:ind w:left="720" w:hanging="360"/>
+              <w:rPr>
+                <w:sz w:val="28"/>
+                <w:szCs w:val="28"/>
+              </w:rPr>
+            </w:pPr>
+            <w:r>
+              <w:rPr>
+                <w:sz w:val="28"/>
+                <w:szCs w:val="28"/>
+                <w:rtl w:val="0"/>
+              </w:rPr>
+              <w:t xml:space="preserve">Sistema exibe mensagem "O agendamento não pode ser removido."</w:t>
+            </w:r>
+          </w:p>
+          <w:p>
+            <w:pPr>
+              <w:numPr>
+                <w:ilvl w:val="0"/>
+                <w:numId w:val="4"/>
+              </w:numPr>
+              <w:ind w:left="720" w:hanging="360"/>
+              <w:rPr>
+                <w:sz w:val="28"/>
+                <w:szCs w:val="28"/>
+              </w:rPr>
+            </w:pPr>
+            <w:r>
+              <w:rPr>
+                <w:sz w:val="28"/>
+                <w:szCs w:val="28"/>
+                <w:rtl w:val="0"/>
+              </w:rPr>
+              <w:t xml:space="preserve">Sistema retorna ao Passo 3 da Seção Principal.</w:t>
+            </w:r>
+          </w:p>
+          <w:p>
+            <w:pPr>
+              <w:ind w:left="720" w:firstLine="0"/>
+              <w:rPr>
+                <w:sz w:val="28"/>
+                <w:szCs w:val="28"/>
+              </w:rPr>
+            </w:pPr>
+            <w:r>
+              <w:rPr>
+                <w:rtl w:val="0"/>
+              </w:rPr>
+            </w:r>
+          </w:p>
+        </w:tc>
+      </w:tr>
+    </w:tbl>
     <w:p>
       <w:pPr>
         <w:jc w:val="center"/>
@@ -2788,9 +2578,7 @@
     </w:p>
     <w:p>
       <w:pPr>
-        <w:rPr>
-          <w:vertAlign w:val="baseline"/>
-        </w:rPr>
+        <w:rPr/>
       </w:pPr>
       <w:r>
         <w:rPr>
@@ -2817,13 +2605,13 @@
       </w:tblPr>
       <w:tblGrid>
         <w:gridCol w:w="2628"/>
-        <w:gridCol w:w="1800"/>
-        <w:gridCol w:w="6120"/>
+        <w:gridCol w:w="2011"/>
+        <w:gridCol w:w="5909"/>
         <w:tblGridChange w:id="0">
           <w:tblGrid>
             <w:gridCol w:w="2628"/>
-            <w:gridCol w:w="1800"/>
-            <w:gridCol w:w="6120"/>
+            <w:gridCol w:w="2011"/>
+            <w:gridCol w:w="5909"/>
           </w:tblGrid>
         </w:tblGridChange>
       </w:tblGrid>
@@ -2841,17 +2629,13 @@
               <w:bottom w:color="000000" w:space="0" w:sz="4" w:val="single"/>
               <w:right w:color="000000" w:space="0" w:sz="4" w:val="single"/>
             </w:tcBorders>
-            <w:vAlign w:val="top"/>
           </w:tcPr>
           <w:p>
             <w:pPr>
               <w:jc w:val="center"/>
               <w:rPr>
-                <w:b w:val="0"/>
-                <w:bCs w:val="0"/>
-                <w:sz w:val="28"/>
-                <w:szCs w:val="28"/>
-                <w:vertAlign w:val="baseline"/>
+                <w:sz w:val="28"/>
+                <w:szCs w:val="28"/>
               </w:rPr>
             </w:pPr>
             <w:r>
@@ -2860,7 +2644,6 @@
                 <w:bCs w:val="1"/>
                 <w:sz w:val="28"/>
                 <w:szCs w:val="28"/>
-                <w:vertAlign w:val="baseline"/>
                 <w:rtl w:val="0"/>
               </w:rPr>
               <w:t xml:space="preserve">Histórico</w:t>
@@ -2886,18 +2669,14 @@
               <w:bottom w:color="000000" w:space="0" w:sz="4" w:val="single"/>
               <w:right w:color="000000" w:space="0" w:sz="4" w:val="single"/>
             </w:tcBorders>
-            <w:vAlign w:val="top"/>
           </w:tcPr>
           <w:p>
             <w:pPr>
               <w:jc w:val="center"/>
-              <w:rPr>
-                <w:vertAlign w:val="baseline"/>
-              </w:rPr>
-            </w:pPr>
-            <w:r>
-              <w:rPr>
-                <w:vertAlign w:val="baseline"/>
+              <w:rPr/>
+            </w:pPr>
+            <w:r>
+              <w:rPr>
                 <w:rtl w:val="0"/>
               </w:rPr>
               <w:t xml:space="preserve">Data</w:t>
@@ -2912,18 +2691,14 @@
               <w:bottom w:color="000000" w:space="0" w:sz="4" w:val="single"/>
               <w:right w:color="000000" w:space="0" w:sz="4" w:val="single"/>
             </w:tcBorders>
-            <w:vAlign w:val="top"/>
           </w:tcPr>
           <w:p>
             <w:pPr>
               <w:jc w:val="center"/>
-              <w:rPr>
-                <w:vertAlign w:val="baseline"/>
-              </w:rPr>
-            </w:pPr>
-            <w:r>
-              <w:rPr>
-                <w:vertAlign w:val="baseline"/>
+              <w:rPr/>
+            </w:pPr>
+            <w:r>
+              <w:rPr>
                 <w:rtl w:val="0"/>
               </w:rPr>
               <w:t xml:space="preserve">Pessoa</w:t>
@@ -2938,18 +2713,14 @@
               <w:bottom w:color="000000" w:space="0" w:sz="4" w:val="single"/>
               <w:right w:color="000000" w:space="0" w:sz="4" w:val="single"/>
             </w:tcBorders>
-            <w:vAlign w:val="top"/>
           </w:tcPr>
           <w:p>
             <w:pPr>
               <w:jc w:val="center"/>
-              <w:rPr>
-                <w:vertAlign w:val="baseline"/>
-              </w:rPr>
-            </w:pPr>
-            <w:r>
-              <w:rPr>
-                <w:vertAlign w:val="baseline"/>
+              <w:rPr/>
+            </w:pPr>
+            <w:r>
+              <w:rPr>
                 <w:rtl w:val="0"/>
               </w:rPr>
               <w:t xml:space="preserve">Alteração</w:t>
@@ -2960,7 +2731,7 @@
       <w:tr>
         <w:trPr>
           <w:cantSplit w:val="0"/>
-          <w:trHeight w:val="296.953125" w:hRule="atLeast"/>
+          <w:trHeight w:val="332" w:hRule="atLeast"/>
           <w:tblHeader w:val="0"/>
         </w:trPr>
         <w:tc>
@@ -2971,25 +2742,17 @@
               <w:bottom w:color="000000" w:space="0" w:sz="4" w:val="single"/>
               <w:right w:color="000000" w:space="0" w:sz="4" w:val="single"/>
             </w:tcBorders>
-            <w:vAlign w:val="top"/>
           </w:tcPr>
           <w:p>
             <w:pPr>
               <w:jc w:val="center"/>
-              <w:rPr>
-                <w:vertAlign w:val="baseline"/>
-              </w:rPr>
+              <w:rPr/>
             </w:pPr>
             <w:r>
               <w:rPr>
                 <w:rtl w:val="0"/>
               </w:rPr>
               <w:t xml:space="preserve">17/06/5026</w:t>
-            </w:r>
-            <w:r>
-              <w:rPr>
-                <w:rtl w:val="0"/>
-              </w:rPr>
             </w:r>
           </w:p>
         </w:tc>
@@ -3001,25 +2764,17 @@
               <w:bottom w:color="000000" w:space="0" w:sz="4" w:val="single"/>
               <w:right w:color="000000" w:space="0" w:sz="4" w:val="single"/>
             </w:tcBorders>
-            <w:vAlign w:val="top"/>
           </w:tcPr>
           <w:p>
             <w:pPr>
               <w:jc w:val="center"/>
-              <w:rPr>
-                <w:vertAlign w:val="baseline"/>
-              </w:rPr>
+              <w:rPr/>
             </w:pPr>
             <w:r>
               <w:rPr>
                 <w:rtl w:val="0"/>
               </w:rPr>
               <w:t xml:space="preserve">Pedro Henrique</w:t>
-            </w:r>
-            <w:r>
-              <w:rPr>
-                <w:rtl w:val="0"/>
-              </w:rPr>
             </w:r>
           </w:p>
         </w:tc>
@@ -3031,18 +2786,14 @@
               <w:bottom w:color="000000" w:space="0" w:sz="4" w:val="single"/>
               <w:right w:color="000000" w:space="0" w:sz="4" w:val="single"/>
             </w:tcBorders>
-            <w:vAlign w:val="top"/>
           </w:tcPr>
           <w:p>
             <w:pPr>
               <w:jc w:val="center"/>
-              <w:rPr>
-                <w:vertAlign w:val="baseline"/>
-              </w:rPr>
-            </w:pPr>
-            <w:r>
-              <w:rPr>
-                <w:vertAlign w:val="baseline"/>
+              <w:rPr/>
+            </w:pPr>
+            <w:r>
+              <w:rPr>
                 <w:rtl w:val="0"/>
               </w:rPr>
               <w:t xml:space="preserve">Criação do Caso de Uso</w:t>
@@ -3051,9 +2802,7 @@
           <w:p>
             <w:pPr>
               <w:jc w:val="center"/>
-              <w:rPr>
-                <w:vertAlign w:val="baseline"/>
-              </w:rPr>
+              <w:rPr/>
             </w:pPr>
             <w:r>
               <w:rPr>
@@ -3066,6 +2815,7 @@
       <w:tr>
         <w:trPr>
           <w:cantSplit w:val="0"/>
+          <w:trHeight w:val="610" w:hRule="atLeast"/>
           <w:tblHeader w:val="0"/>
         </w:trPr>
         <w:tc>
@@ -3076,25 +2826,17 @@
               <w:bottom w:color="000000" w:space="0" w:sz="4" w:val="single"/>
               <w:right w:color="000000" w:space="0" w:sz="4" w:val="single"/>
             </w:tcBorders>
-            <w:vAlign w:val="top"/>
           </w:tcPr>
           <w:p>
             <w:pPr>
               <w:jc w:val="center"/>
-              <w:rPr>
-                <w:vertAlign w:val="baseline"/>
-              </w:rPr>
+              <w:rPr/>
             </w:pPr>
             <w:r>
               <w:rPr>
                 <w:rtl w:val="0"/>
               </w:rPr>
               <w:t xml:space="preserve">20/06/2026</w:t>
-            </w:r>
-            <w:r>
-              <w:rPr>
-                <w:rtl w:val="0"/>
-              </w:rPr>
             </w:r>
           </w:p>
         </w:tc>
@@ -3106,25 +2848,17 @@
               <w:bottom w:color="000000" w:space="0" w:sz="4" w:val="single"/>
               <w:right w:color="000000" w:space="0" w:sz="4" w:val="single"/>
             </w:tcBorders>
-            <w:vAlign w:val="top"/>
           </w:tcPr>
           <w:p>
             <w:pPr>
               <w:jc w:val="center"/>
-              <w:rPr>
-                <w:vertAlign w:val="baseline"/>
-              </w:rPr>
+              <w:rPr/>
             </w:pPr>
             <w:r>
               <w:rPr>
                 <w:rtl w:val="0"/>
               </w:rPr>
               <w:t xml:space="preserve">Daiane Santos</w:t>
-            </w:r>
-            <w:r>
-              <w:rPr>
-                <w:rtl w:val="0"/>
-              </w:rPr>
             </w:r>
           </w:p>
         </w:tc>
@@ -3136,25 +2870,17 @@
               <w:bottom w:color="000000" w:space="0" w:sz="4" w:val="single"/>
               <w:right w:color="000000" w:space="0" w:sz="4" w:val="single"/>
             </w:tcBorders>
-            <w:vAlign w:val="top"/>
           </w:tcPr>
           <w:p>
             <w:pPr>
               <w:jc w:val="center"/>
-              <w:rPr>
-                <w:vertAlign w:val="baseline"/>
-              </w:rPr>
+              <w:rPr/>
             </w:pPr>
             <w:r>
               <w:rPr>
                 <w:rtl w:val="0"/>
               </w:rPr>
               <w:t xml:space="preserve">Adição de fluxo alternativo e Correção de fluxo principal</w:t>
-            </w:r>
-            <w:r>
-              <w:rPr>
-                <w:rtl w:val="0"/>
-              </w:rPr>
             </w:r>
           </w:p>
         </w:tc>
@@ -3162,6 +2888,7 @@
       <w:tr>
         <w:trPr>
           <w:cantSplit w:val="0"/>
+          <w:trHeight w:val="562" w:hRule="atLeast"/>
           <w:tblHeader w:val="0"/>
         </w:trPr>
         <w:tc>
@@ -3172,7 +2899,6 @@
               <w:bottom w:color="000000" w:space="0" w:sz="4" w:val="single"/>
               <w:right w:color="000000" w:space="0" w:sz="4" w:val="single"/>
             </w:tcBorders>
-            <w:vAlign w:val="top"/>
           </w:tcPr>
           <w:p>
             <w:pPr>
@@ -3195,7 +2921,6 @@
               <w:bottom w:color="000000" w:space="0" w:sz="4" w:val="single"/>
               <w:right w:color="000000" w:space="0" w:sz="4" w:val="single"/>
             </w:tcBorders>
-            <w:vAlign w:val="top"/>
           </w:tcPr>
           <w:p>
             <w:pPr>
@@ -3218,7 +2943,6 @@
               <w:bottom w:color="000000" w:space="0" w:sz="4" w:val="single"/>
               <w:right w:color="000000" w:space="0" w:sz="4" w:val="single"/>
             </w:tcBorders>
-            <w:vAlign w:val="top"/>
           </w:tcPr>
           <w:p>
             <w:pPr>
@@ -3237,6 +2961,7 @@
       <w:tr>
         <w:trPr>
           <w:cantSplit w:val="0"/>
+          <w:trHeight w:val="556" w:hRule="atLeast"/>
           <w:tblHeader w:val="0"/>
         </w:trPr>
         <w:tc>
@@ -3247,7 +2972,6 @@
               <w:bottom w:color="000000" w:space="0" w:sz="4" w:val="single"/>
               <w:right w:color="000000" w:space="0" w:sz="4" w:val="single"/>
             </w:tcBorders>
-            <w:vAlign w:val="top"/>
           </w:tcPr>
           <w:p>
             <w:pPr>
@@ -3270,7 +2994,6 @@
               <w:bottom w:color="000000" w:space="0" w:sz="4" w:val="single"/>
               <w:right w:color="000000" w:space="0" w:sz="4" w:val="single"/>
             </w:tcBorders>
-            <w:vAlign w:val="top"/>
           </w:tcPr>
           <w:p>
             <w:pPr>
@@ -3293,7 +3016,6 @@
               <w:bottom w:color="000000" w:space="0" w:sz="4" w:val="single"/>
               <w:right w:color="000000" w:space="0" w:sz="4" w:val="single"/>
             </w:tcBorders>
-            <w:vAlign w:val="top"/>
           </w:tcPr>
           <w:p>
             <w:pPr>
@@ -3305,6 +3027,79 @@
                 <w:rtl w:val="0"/>
               </w:rPr>
               <w:t xml:space="preserve">Adição de Fluxo Exceção</w:t>
+            </w:r>
+          </w:p>
+        </w:tc>
+      </w:tr>
+      <w:tr>
+        <w:trPr>
+          <w:cantSplit w:val="0"/>
+          <w:trHeight w:val="564" w:hRule="atLeast"/>
+          <w:tblHeader w:val="0"/>
+        </w:trPr>
+        <w:tc>
+          <w:tcPr>
+            <w:tcBorders>
+              <w:top w:color="000000" w:space="0" w:sz="4" w:val="single"/>
+              <w:left w:color="000000" w:space="0" w:sz="4" w:val="single"/>
+              <w:bottom w:color="000000" w:space="0" w:sz="4" w:val="single"/>
+              <w:right w:color="000000" w:space="0" w:sz="4" w:val="single"/>
+            </w:tcBorders>
+          </w:tcPr>
+          <w:p>
+            <w:pPr>
+              <w:jc w:val="center"/>
+              <w:rPr/>
+            </w:pPr>
+            <w:r>
+              <w:rPr>
+                <w:rtl w:val="0"/>
+              </w:rPr>
+              <w:t xml:space="preserve">09/10/2026</w:t>
+            </w:r>
+          </w:p>
+        </w:tc>
+        <w:tc>
+          <w:tcPr>
+            <w:tcBorders>
+              <w:top w:color="000000" w:space="0" w:sz="4" w:val="single"/>
+              <w:left w:color="000000" w:space="0" w:sz="4" w:val="single"/>
+              <w:bottom w:color="000000" w:space="0" w:sz="4" w:val="single"/>
+              <w:right w:color="000000" w:space="0" w:sz="4" w:val="single"/>
+            </w:tcBorders>
+          </w:tcPr>
+          <w:p>
+            <w:pPr>
+              <w:jc w:val="center"/>
+              <w:rPr/>
+            </w:pPr>
+            <w:r>
+              <w:rPr>
+                <w:rtl w:val="0"/>
+              </w:rPr>
+              <w:t xml:space="preserve">Daiane Santos</w:t>
+            </w:r>
+          </w:p>
+        </w:tc>
+        <w:tc>
+          <w:tcPr>
+            <w:tcBorders>
+              <w:top w:color="000000" w:space="0" w:sz="4" w:val="single"/>
+              <w:left w:color="000000" w:space="0" w:sz="4" w:val="single"/>
+              <w:bottom w:color="000000" w:space="0" w:sz="4" w:val="single"/>
+              <w:right w:color="000000" w:space="0" w:sz="4" w:val="single"/>
+            </w:tcBorders>
+          </w:tcPr>
+          <w:p>
+            <w:pPr>
+              <w:jc w:val="center"/>
+              <w:rPr/>
+            </w:pPr>
+            <w:r>
+              <w:rPr>
+                <w:rtl w:val="0"/>
+              </w:rPr>
+              <w:t xml:space="preserve">Acrescenta maior fidelidade às telas</w:t>
             </w:r>
           </w:p>
         </w:tc>
@@ -3312,9 +3107,7 @@
     </w:tbl>
     <w:p>
       <w:pPr>
-        <w:rPr>
-          <w:vertAlign w:val="baseline"/>
-        </w:rPr>
+        <w:rPr/>
       </w:pPr>
       <w:r>
         <w:rPr>
@@ -3828,7 +3621,6 @@
       <w:bCs w:val="1"/>
       <w:sz w:val="28"/>
       <w:szCs w:val="28"/>
-      <w:vertAlign w:val="baseline"/>
     </w:rPr>
   </w:style>
   <w:style w:type="paragraph" w:styleId="Heading2">
@@ -3842,7 +3634,6 @@
     <w:rPr>
       <w:sz w:val="28"/>
       <w:szCs w:val="28"/>
-      <w:vertAlign w:val="baseline"/>
     </w:rPr>
   </w:style>
   <w:style w:type="paragraph" w:styleId="Heading3">
@@ -3852,7 +3643,6 @@
     <w:pPr>
       <w:keepNext w:val="1"/>
       <w:keepLines w:val="1"/>
-      <w:pageBreakBefore w:val="0"/>
       <w:spacing w:after="80" w:before="280" w:lineRule="auto"/>
     </w:pPr>
     <w:rPr>
@@ -3869,14 +3659,11 @@
     <w:pPr>
       <w:keepNext w:val="1"/>
       <w:keepLines w:val="1"/>
-      <w:pageBreakBefore w:val="0"/>
       <w:spacing w:after="40" w:before="240" w:lineRule="auto"/>
     </w:pPr>
     <w:rPr>
       <w:b w:val="1"/>
       <w:bCs w:val="1"/>
-      <w:sz w:val="24"/>
-      <w:szCs w:val="24"/>
     </w:rPr>
   </w:style>
   <w:style w:type="paragraph" w:styleId="Heading5">
@@ -3886,7 +3673,6 @@
     <w:pPr>
       <w:keepNext w:val="1"/>
       <w:keepLines w:val="1"/>
-      <w:pageBreakBefore w:val="0"/>
       <w:spacing w:after="40" w:before="220" w:lineRule="auto"/>
     </w:pPr>
     <w:rPr>
@@ -3903,7 +3689,6 @@
     <w:pPr>
       <w:keepNext w:val="1"/>
       <w:keepLines w:val="1"/>
-      <w:pageBreakBefore w:val="0"/>
       <w:spacing w:after="40" w:before="200" w:lineRule="auto"/>
     </w:pPr>
     <w:rPr>
@@ -3925,7 +3710,6 @@
       <w:bCs w:val="1"/>
       <w:sz w:val="32"/>
       <w:szCs w:val="32"/>
-      <w:vertAlign w:val="baseline"/>
     </w:rPr>
   </w:style>
   <w:style w:type="paragraph" w:styleId="Subtitle">
@@ -3935,7 +3719,6 @@
     <w:pPr>
       <w:keepNext w:val="1"/>
       <w:keepLines w:val="1"/>
-      <w:pageBreakBefore w:val="0"/>
       <w:spacing w:after="80" w:before="360" w:lineRule="auto"/>
     </w:pPr>
     <w:rPr>
@@ -4320,19 +4103,4 @@
   </a:objectDefaults>
   <a:extraClrSchemeLst/>
 </a:theme>
-</file>
-
-<file path=customXML/item1.xml><?xml version="1.0" encoding="utf-8"?>
-<go:gDocsCustomXmlDataStorage xmlns:go="http://customooxmlschemas.google.com/" xmlns:r="http://schemas.openxmlformats.org/officeDocument/2006/relationships" uri="GoogleDocsCustomDataVersion2">
-  <go:docsCustomData xmlns:go="http://customooxmlschemas.google.com/" roundtripDataSignature="AMtx7mjgStyps5ih+RHpzYYTYBbE2bBB2w==">CgMxLjAaHwoBMBIaChgICVIUChJ0YWJsZS4xcGtxMTV4MTNiMWsyDmguc3dlN2oxNWJ2ODhwMg5oLjl5amxrejkyZ2tvajgAciExYjJ1bWlMLXZjYTlqaWJHbzNxdS1YY3E0SExVV1hDRks=</go:docsCustomData>
-</go:gDocsCustomXmlDataStorage>
-</file>
-
-<file path=customXML/itemProps1.xml><?xml version="1.0" encoding="utf-8"?>
-<ds:datastoreItem xmlns:ds="http://schemas.openxmlformats.org/officeDocument/2006/customXml" ds:itemID="{11111111-1234-1234-1234-123412341234}">
-  <ds:schemaRefs>
-    <ds:schemaRef ds:uri="http://schemas.openxmlformats.org/officeDocument/2006/relationships"/>
-    <ds:schemaRef ds:uri="http://customooxmlschemas.google.com/"/>
-  </ds:schemaRefs>
-</ds:datastoreItem>
 </file>
</xml_diff>